<commit_message>
Say what the pressure number is: the curve at this airflow, not the ESP
The basis-of-design table and the conclusions quoted the rise across the most
loaded unit against "the datasheet", but the number they compared it with was
the unit's P-Q curve interpolated at the airflow this hall actually moves --
131 Pa on the worked double-gallery case, where the datasheet's external
static pressure at the selection point is 100. Both are real numbers and they
answer different questions, and a report that labels one as the other is
worse than one that omits it. They are now two rows, the fan_capacity check
says which it used, and the conclusion adds the sentence a reader needs: the
rise is the resistance of the room, not of the coil and filters inside the
machine, which the ESP already accounts for.

Co-Authored-By: Claude Opus 5 <noreply@anthropic.com>
Claude-Session: https://claude.ai/code/session_01S21ewTFM1RcXhxwR5hRE5Z
</commit_message>
<xml_diff>
--- a/results/hall-double-gallery/hall-double-gallery.docx
+++ b/results/hall-double-gallery/hall-double-gallery.docx
@@ -117,7 +117,7 @@
           <w:color w:val="898781"/>
           <w:sz w:val="16"/>
         </w:rPr>
-        <w:t>Case hall-double-gallery · solved to iteration 1700 · 275,400 cells · all checks passed</w:t>
+        <w:t>Case hall-double-gallery · solved to iteration 1800 · 275,400 cells · all checks passed</w:t>
       </w:r>
     </w:p>
     <w:p>
@@ -778,7 +778,7 @@
                 <w:color w:val="0B0B0B"/>
                 <w:sz w:val="17"/>
               </w:rPr>
-              <w:t>External static pressure</w:t>
+              <w:t>External static pressure, at the rated airflow</w:t>
             </w:r>
           </w:p>
         </w:tc>
@@ -797,7 +797,47 @@
                 <w:color w:val="0B0B0B"/>
                 <w:sz w:val="17"/>
               </w:rPr>
-              <w:t>131 Pa</w:t>
+              <w:t>100 Pa</w:t>
+            </w:r>
+          </w:p>
+        </w:tc>
+      </w:tr>
+      <w:tr>
+        <w:tc>
+          <w:tcPr>
+            <w:tcW w:type="dxa" w:w="4535"/>
+          </w:tcPr>
+          <w:p>
+            <w:pPr>
+              <w:spacing w:after="40"/>
+            </w:pPr>
+            <w:r>
+              <w:rPr>
+                <w:b/>
+                <w:i w:val="0"/>
+                <w:color w:val="0B0B0B"/>
+                <w:sz w:val="17"/>
+              </w:rPr>
+              <w:t>Static pressure available at the modelled airflow</w:t>
+            </w:r>
+          </w:p>
+        </w:tc>
+        <w:tc>
+          <w:tcPr>
+            <w:tcW w:type="dxa" w:w="4535"/>
+          </w:tcPr>
+          <w:p>
+            <w:pPr>
+              <w:spacing w:after="40"/>
+            </w:pPr>
+            <w:r>
+              <w:rPr>
+                <w:b w:val="0"/>
+                <w:i w:val="0"/>
+                <w:color w:val="0B0B0B"/>
+                <w:sz w:val="17"/>
+              </w:rPr>
+              <w:t>131 Pa (interpolated on the unit's P-Q curve)</w:t>
             </w:r>
           </w:p>
         </w:tc>
@@ -1060,7 +1100,7 @@
                 <w:color w:val="0B0B0B"/>
                 <w:sz w:val="17"/>
               </w:rPr>
-              <w:t>22.43 °C</w:t>
+              <w:t>22.49 °C</w:t>
             </w:r>
           </w:p>
         </w:tc>
@@ -1079,7 +1119,7 @@
                 <w:color w:val="0B0B0B"/>
                 <w:sz w:val="17"/>
               </w:rPr>
-              <w:t>rack F5B2-04, against the 27 °C ASHRAE recommended limit</w:t>
+              <w:t>rack F5B1-17, against the 27 °C ASHRAE recommended limit</w:t>
             </w:r>
           </w:p>
         </w:tc>
@@ -1237,7 +1277,7 @@
                 <w:color w:val="0B0B0B"/>
                 <w:sz w:val="17"/>
               </w:rPr>
-              <w:t>56.1 Pa</w:t>
+              <w:t>56.2 Pa</w:t>
             </w:r>
           </w:p>
         </w:tc>
@@ -1256,7 +1296,7 @@
                 <w:color w:val="0B0B0B"/>
                 <w:sz w:val="17"/>
               </w:rPr>
-              <w:t>of 131 Pa available</w:t>
+              <w:t>of the 131 Pa the unit can produce at this airflow</w:t>
             </w:r>
           </w:p>
         </w:tc>
@@ -2729,7 +2769,7 @@
                 <w:color w:val="0CA30C"/>
                 <w:sz w:val="17"/>
               </w:rPr>
-              <w:t>PASS — fan supplies 443.12804 kg/s and draws 443.12799 kg/s (0.000% apart)</w:t>
+              <w:t>PASS — fan supplies 443.12804 kg/s and draws 443.12801 kg/s (0.000% apart)</w:t>
             </w:r>
           </w:p>
         </w:tc>
@@ -2906,7 +2946,7 @@
                 <w:color w:val="0CA30C"/>
                 <w:sz w:val="17"/>
               </w:rPr>
-              <w:t>PASS — the return air carries 5099.62 kW of the 5099.60 kW installed (100%)</w:t>
+              <w:t>PASS — the return air carries 5099.52 kW of the 5099.60 kW installed (100%)</w:t>
             </w:r>
           </w:p>
         </w:tc>
@@ -3142,7 +3182,7 @@
                 <w:color w:val="0CA30C"/>
                 <w:sz w:val="17"/>
               </w:rPr>
-              <w:t>PASS — the most loaded unit (fan5) costs 56.1 Pa, the least 52.8 Pa, and the fan wall's datasheet offers 131 Pa at 104,181 m3/h per unit (43%); uncontrolled at full speed it would run at 128,854 m3/h and 85.9 Pa</w:t>
+              <w:t>PASS — the most loaded unit (fan5) costs 56.2 Pa, the least 52.8 Pa, and the unit's P-Q curve offers 131 Pa at 104,181 m3/h per unit (43%); uncontrolled at full speed it would run at 128,817 m3/h and 85.9 Pa</w:t>
             </w:r>
           </w:p>
         </w:tc>
@@ -3260,7 +3300,7 @@
                 <w:color w:val="0CA30C"/>
                 <w:sz w:val="17"/>
               </w:rPr>
-              <w:t>PASS — warmest rack inlet 22.4 degC at the top of F5B2-04 -- within ASHRAE recommended (18.0-27.0 degC)</w:t>
+              <w:t>PASS — warmest rack inlet 22.5 degC at the top of F5B1-17 -- within ASHRAE recommended (18.0-27.0 degC)</w:t>
             </w:r>
           </w:p>
         </w:tc>
@@ -3319,7 +3359,7 @@
                 <w:color w:val="0CA30C"/>
                 <w:sz w:val="17"/>
               </w:rPr>
-              <w:t>PASS — peak 5.47 m/s against a plausible 11.99 m/s (peak air 38.4 degC)</w:t>
+              <w:t>PASS — peak 5.49 m/s against a plausible 11.99 m/s (peak air 38.4 degC)</w:t>
             </w:r>
           </w:p>
         </w:tc>
@@ -3371,7 +3411,7 @@
       <w:r>
         <w:drawing>
           <wp:inline xmlns:a="http://schemas.openxmlformats.org/drawingml/2006/main" xmlns:pic="http://schemas.openxmlformats.org/drawingml/2006/picture">
-            <wp:extent cx="5760000" cy="2034112"/>
+            <wp:extent cx="5760000" cy="2058294"/>
             <wp:docPr id="1" name="Picture 1"/>
             <wp:cNvGraphicFramePr>
               <a:graphicFrameLocks noChangeAspect="1"/>
@@ -3392,7 +3432,7 @@
                   <pic:spPr>
                     <a:xfrm>
                       <a:off x="0" y="0"/>
-                      <a:ext cx="5760000" cy="2034112"/>
+                      <a:ext cx="5760000" cy="2058294"/>
                     </a:xfrm>
                     <a:prstGeom prst="rect"/>
                   </pic:spPr>
@@ -4013,6 +4053,276 @@
                 <w:color w:val="0B0B0B"/>
                 <w:sz w:val="17"/>
               </w:rPr>
+              <w:t>F5B1-17</w:t>
+            </w:r>
+          </w:p>
+        </w:tc>
+        <w:tc>
+          <w:tcPr>
+            <w:tcW w:type="dxa" w:w="1360"/>
+          </w:tcPr>
+          <w:p>
+            <w:pPr>
+              <w:spacing w:after="40"/>
+            </w:pPr>
+            <w:r>
+              <w:rPr>
+                <w:b w:val="0"/>
+                <w:i w:val="0"/>
+                <w:color w:val="0B0B0B"/>
+                <w:sz w:val="17"/>
+              </w:rPr>
+              <w:t>F5B1</w:t>
+            </w:r>
+          </w:p>
+        </w:tc>
+        <w:tc>
+          <w:tcPr>
+            <w:tcW w:type="dxa" w:w="1360"/>
+          </w:tcPr>
+          <w:p>
+            <w:pPr>
+              <w:spacing w:after="40"/>
+            </w:pPr>
+            <w:r>
+              <w:rPr>
+                <w:b w:val="0"/>
+                <w:i w:val="0"/>
+                <w:color w:val="0B0B0B"/>
+                <w:sz w:val="17"/>
+              </w:rPr>
+              <w:t>22.49 °C</w:t>
+            </w:r>
+          </w:p>
+        </w:tc>
+        <w:tc>
+          <w:tcPr>
+            <w:tcW w:type="dxa" w:w="1360"/>
+          </w:tcPr>
+          <w:p>
+            <w:pPr>
+              <w:spacing w:after="40"/>
+            </w:pPr>
+            <w:r>
+              <w:rPr>
+                <w:b w:val="0"/>
+                <w:i w:val="0"/>
+                <w:color w:val="0B0B0B"/>
+                <w:sz w:val="17"/>
+              </w:rPr>
+              <w:t>23.26 °C</w:t>
+            </w:r>
+          </w:p>
+        </w:tc>
+        <w:tc>
+          <w:tcPr>
+            <w:tcW w:type="dxa" w:w="1360"/>
+          </w:tcPr>
+          <w:p>
+            <w:pPr>
+              <w:spacing w:after="40"/>
+            </w:pPr>
+            <w:r>
+              <w:rPr>
+                <w:b w:val="0"/>
+                <w:i w:val="0"/>
+                <w:color w:val="0B0B0B"/>
+                <w:sz w:val="17"/>
+              </w:rPr>
+              <w:t>33.75 °C</w:t>
+            </w:r>
+          </w:p>
+        </w:tc>
+        <w:tc>
+          <w:tcPr>
+            <w:tcW w:type="dxa" w:w="1360"/>
+          </w:tcPr>
+          <w:p>
+            <w:pPr>
+              <w:spacing w:after="40"/>
+            </w:pPr>
+            <w:r>
+              <w:rPr>
+                <w:b w:val="0"/>
+                <w:i w:val="0"/>
+                <w:color w:val="0B0B0B"/>
+                <w:sz w:val="17"/>
+              </w:rPr>
+              <w:t>10.49 K</w:t>
+            </w:r>
+          </w:p>
+        </w:tc>
+        <w:tc>
+          <w:tcPr>
+            <w:tcW w:type="dxa" w:w="1360"/>
+          </w:tcPr>
+          <w:p>
+            <w:pPr>
+              <w:spacing w:after="40"/>
+            </w:pPr>
+            <w:r>
+              <w:rPr>
+                <w:b w:val="0"/>
+                <w:i w:val="0"/>
+                <w:color w:val="0B0B0B"/>
+                <w:sz w:val="17"/>
+              </w:rPr>
+              <w:t>within ASHRAE recommended (18.0-27.0 degC)</w:t>
+            </w:r>
+          </w:p>
+        </w:tc>
+      </w:tr>
+      <w:tr>
+        <w:tc>
+          <w:tcPr>
+            <w:tcW w:type="dxa" w:w="1360"/>
+          </w:tcPr>
+          <w:p>
+            <w:pPr>
+              <w:spacing w:after="40"/>
+            </w:pPr>
+            <w:r>
+              <w:rPr>
+                <w:b w:val="0"/>
+                <w:i w:val="0"/>
+                <w:color w:val="0B0B0B"/>
+                <w:sz w:val="17"/>
+              </w:rPr>
+              <w:t>F6B2-04</w:t>
+            </w:r>
+          </w:p>
+        </w:tc>
+        <w:tc>
+          <w:tcPr>
+            <w:tcW w:type="dxa" w:w="1360"/>
+          </w:tcPr>
+          <w:p>
+            <w:pPr>
+              <w:spacing w:after="40"/>
+            </w:pPr>
+            <w:r>
+              <w:rPr>
+                <w:b w:val="0"/>
+                <w:i w:val="0"/>
+                <w:color w:val="0B0B0B"/>
+                <w:sz w:val="17"/>
+              </w:rPr>
+              <w:t>F6B2</w:t>
+            </w:r>
+          </w:p>
+        </w:tc>
+        <w:tc>
+          <w:tcPr>
+            <w:tcW w:type="dxa" w:w="1360"/>
+          </w:tcPr>
+          <w:p>
+            <w:pPr>
+              <w:spacing w:after="40"/>
+            </w:pPr>
+            <w:r>
+              <w:rPr>
+                <w:b w:val="0"/>
+                <w:i w:val="0"/>
+                <w:color w:val="0B0B0B"/>
+                <w:sz w:val="17"/>
+              </w:rPr>
+              <w:t>22.49 °C</w:t>
+            </w:r>
+          </w:p>
+        </w:tc>
+        <w:tc>
+          <w:tcPr>
+            <w:tcW w:type="dxa" w:w="1360"/>
+          </w:tcPr>
+          <w:p>
+            <w:pPr>
+              <w:spacing w:after="40"/>
+            </w:pPr>
+            <w:r>
+              <w:rPr>
+                <w:b w:val="0"/>
+                <w:i w:val="0"/>
+                <w:color w:val="0B0B0B"/>
+                <w:sz w:val="17"/>
+              </w:rPr>
+              <w:t>23.21 °C</w:t>
+            </w:r>
+          </w:p>
+        </w:tc>
+        <w:tc>
+          <w:tcPr>
+            <w:tcW w:type="dxa" w:w="1360"/>
+          </w:tcPr>
+          <w:p>
+            <w:pPr>
+              <w:spacing w:after="40"/>
+            </w:pPr>
+            <w:r>
+              <w:rPr>
+                <w:b w:val="0"/>
+                <w:i w:val="0"/>
+                <w:color w:val="0B0B0B"/>
+                <w:sz w:val="17"/>
+              </w:rPr>
+              <w:t>33.74 °C</w:t>
+            </w:r>
+          </w:p>
+        </w:tc>
+        <w:tc>
+          <w:tcPr>
+            <w:tcW w:type="dxa" w:w="1360"/>
+          </w:tcPr>
+          <w:p>
+            <w:pPr>
+              <w:spacing w:after="40"/>
+            </w:pPr>
+            <w:r>
+              <w:rPr>
+                <w:b w:val="0"/>
+                <w:i w:val="0"/>
+                <w:color w:val="0B0B0B"/>
+                <w:sz w:val="17"/>
+              </w:rPr>
+              <w:t>10.53 K</w:t>
+            </w:r>
+          </w:p>
+        </w:tc>
+        <w:tc>
+          <w:tcPr>
+            <w:tcW w:type="dxa" w:w="1360"/>
+          </w:tcPr>
+          <w:p>
+            <w:pPr>
+              <w:spacing w:after="40"/>
+            </w:pPr>
+            <w:r>
+              <w:rPr>
+                <w:b w:val="0"/>
+                <w:i w:val="0"/>
+                <w:color w:val="0B0B0B"/>
+                <w:sz w:val="17"/>
+              </w:rPr>
+              <w:t>within ASHRAE recommended (18.0-27.0 degC)</w:t>
+            </w:r>
+          </w:p>
+        </w:tc>
+      </w:tr>
+      <w:tr>
+        <w:tc>
+          <w:tcPr>
+            <w:tcW w:type="dxa" w:w="1360"/>
+          </w:tcPr>
+          <w:p>
+            <w:pPr>
+              <w:spacing w:after="40"/>
+            </w:pPr>
+            <w:r>
+              <w:rPr>
+                <w:b w:val="0"/>
+                <w:i w:val="0"/>
+                <w:color w:val="0B0B0B"/>
+                <w:sz w:val="17"/>
+              </w:rPr>
               <w:t>F5B2-04</w:t>
             </w:r>
           </w:p>
@@ -4051,7 +4361,7 @@
                 <w:color w:val="0B0B0B"/>
                 <w:sz w:val="17"/>
               </w:rPr>
-              <w:t>22.43 °C</w:t>
+              <w:t>22.47 °C</w:t>
             </w:r>
           </w:p>
         </w:tc>
@@ -4070,7 +4380,7 @@
                 <w:color w:val="0B0B0B"/>
                 <w:sz w:val="17"/>
               </w:rPr>
-              <w:t>23.18 °C</w:t>
+              <w:t>23.19 °C</w:t>
             </w:r>
           </w:p>
         </w:tc>
@@ -4090,6 +4400,546 @@
                 <w:sz w:val="17"/>
               </w:rPr>
               <w:t>33.73 °C</w:t>
+            </w:r>
+          </w:p>
+        </w:tc>
+        <w:tc>
+          <w:tcPr>
+            <w:tcW w:type="dxa" w:w="1360"/>
+          </w:tcPr>
+          <w:p>
+            <w:pPr>
+              <w:spacing w:after="40"/>
+            </w:pPr>
+            <w:r>
+              <w:rPr>
+                <w:b w:val="0"/>
+                <w:i w:val="0"/>
+                <w:color w:val="0B0B0B"/>
+                <w:sz w:val="17"/>
+              </w:rPr>
+              <w:t>10.54 K</w:t>
+            </w:r>
+          </w:p>
+        </w:tc>
+        <w:tc>
+          <w:tcPr>
+            <w:tcW w:type="dxa" w:w="1360"/>
+          </w:tcPr>
+          <w:p>
+            <w:pPr>
+              <w:spacing w:after="40"/>
+            </w:pPr>
+            <w:r>
+              <w:rPr>
+                <w:b w:val="0"/>
+                <w:i w:val="0"/>
+                <w:color w:val="0B0B0B"/>
+                <w:sz w:val="17"/>
+              </w:rPr>
+              <w:t>within ASHRAE recommended (18.0-27.0 degC)</w:t>
+            </w:r>
+          </w:p>
+        </w:tc>
+      </w:tr>
+      <w:tr>
+        <w:tc>
+          <w:tcPr>
+            <w:tcW w:type="dxa" w:w="1360"/>
+          </w:tcPr>
+          <w:p>
+            <w:pPr>
+              <w:spacing w:after="40"/>
+            </w:pPr>
+            <w:r>
+              <w:rPr>
+                <w:b w:val="0"/>
+                <w:i w:val="0"/>
+                <w:color w:val="0B0B0B"/>
+                <w:sz w:val="17"/>
+              </w:rPr>
+              <w:t>F5B1-16</w:t>
+            </w:r>
+          </w:p>
+        </w:tc>
+        <w:tc>
+          <w:tcPr>
+            <w:tcW w:type="dxa" w:w="1360"/>
+          </w:tcPr>
+          <w:p>
+            <w:pPr>
+              <w:spacing w:after="40"/>
+            </w:pPr>
+            <w:r>
+              <w:rPr>
+                <w:b w:val="0"/>
+                <w:i w:val="0"/>
+                <w:color w:val="0B0B0B"/>
+                <w:sz w:val="17"/>
+              </w:rPr>
+              <w:t>F5B1</w:t>
+            </w:r>
+          </w:p>
+        </w:tc>
+        <w:tc>
+          <w:tcPr>
+            <w:tcW w:type="dxa" w:w="1360"/>
+          </w:tcPr>
+          <w:p>
+            <w:pPr>
+              <w:spacing w:after="40"/>
+            </w:pPr>
+            <w:r>
+              <w:rPr>
+                <w:b w:val="0"/>
+                <w:i w:val="0"/>
+                <w:color w:val="0B0B0B"/>
+                <w:sz w:val="17"/>
+              </w:rPr>
+              <w:t>22.45 °C</w:t>
+            </w:r>
+          </w:p>
+        </w:tc>
+        <w:tc>
+          <w:tcPr>
+            <w:tcW w:type="dxa" w:w="1360"/>
+          </w:tcPr>
+          <w:p>
+            <w:pPr>
+              <w:spacing w:after="40"/>
+            </w:pPr>
+            <w:r>
+              <w:rPr>
+                <w:b w:val="0"/>
+                <w:i w:val="0"/>
+                <w:color w:val="0B0B0B"/>
+                <w:sz w:val="17"/>
+              </w:rPr>
+              <w:t>23.22 °C</w:t>
+            </w:r>
+          </w:p>
+        </w:tc>
+        <w:tc>
+          <w:tcPr>
+            <w:tcW w:type="dxa" w:w="1360"/>
+          </w:tcPr>
+          <w:p>
+            <w:pPr>
+              <w:spacing w:after="40"/>
+            </w:pPr>
+            <w:r>
+              <w:rPr>
+                <w:b w:val="0"/>
+                <w:i w:val="0"/>
+                <w:color w:val="0B0B0B"/>
+                <w:sz w:val="17"/>
+              </w:rPr>
+              <w:t>33.73 °C</w:t>
+            </w:r>
+          </w:p>
+        </w:tc>
+        <w:tc>
+          <w:tcPr>
+            <w:tcW w:type="dxa" w:w="1360"/>
+          </w:tcPr>
+          <w:p>
+            <w:pPr>
+              <w:spacing w:after="40"/>
+            </w:pPr>
+            <w:r>
+              <w:rPr>
+                <w:b w:val="0"/>
+                <w:i w:val="0"/>
+                <w:color w:val="0B0B0B"/>
+                <w:sz w:val="17"/>
+              </w:rPr>
+              <w:t>10.51 K</w:t>
+            </w:r>
+          </w:p>
+        </w:tc>
+        <w:tc>
+          <w:tcPr>
+            <w:tcW w:type="dxa" w:w="1360"/>
+          </w:tcPr>
+          <w:p>
+            <w:pPr>
+              <w:spacing w:after="40"/>
+            </w:pPr>
+            <w:r>
+              <w:rPr>
+                <w:b w:val="0"/>
+                <w:i w:val="0"/>
+                <w:color w:val="0B0B0B"/>
+                <w:sz w:val="17"/>
+              </w:rPr>
+              <w:t>within ASHRAE recommended (18.0-27.0 degC)</w:t>
+            </w:r>
+          </w:p>
+        </w:tc>
+      </w:tr>
+      <w:tr>
+        <w:tc>
+          <w:tcPr>
+            <w:tcW w:type="dxa" w:w="1360"/>
+          </w:tcPr>
+          <w:p>
+            <w:pPr>
+              <w:spacing w:after="40"/>
+            </w:pPr>
+            <w:r>
+              <w:rPr>
+                <w:b w:val="0"/>
+                <w:i w:val="0"/>
+                <w:color w:val="0B0B0B"/>
+                <w:sz w:val="17"/>
+              </w:rPr>
+              <w:t>F5B1-18</w:t>
+            </w:r>
+          </w:p>
+        </w:tc>
+        <w:tc>
+          <w:tcPr>
+            <w:tcW w:type="dxa" w:w="1360"/>
+          </w:tcPr>
+          <w:p>
+            <w:pPr>
+              <w:spacing w:after="40"/>
+            </w:pPr>
+            <w:r>
+              <w:rPr>
+                <w:b w:val="0"/>
+                <w:i w:val="0"/>
+                <w:color w:val="0B0B0B"/>
+                <w:sz w:val="17"/>
+              </w:rPr>
+              <w:t>F5B1</w:t>
+            </w:r>
+          </w:p>
+        </w:tc>
+        <w:tc>
+          <w:tcPr>
+            <w:tcW w:type="dxa" w:w="1360"/>
+          </w:tcPr>
+          <w:p>
+            <w:pPr>
+              <w:spacing w:after="40"/>
+            </w:pPr>
+            <w:r>
+              <w:rPr>
+                <w:b w:val="0"/>
+                <w:i w:val="0"/>
+                <w:color w:val="0B0B0B"/>
+                <w:sz w:val="17"/>
+              </w:rPr>
+              <w:t>22.45 °C</w:t>
+            </w:r>
+          </w:p>
+        </w:tc>
+        <w:tc>
+          <w:tcPr>
+            <w:tcW w:type="dxa" w:w="1360"/>
+          </w:tcPr>
+          <w:p>
+            <w:pPr>
+              <w:spacing w:after="40"/>
+            </w:pPr>
+            <w:r>
+              <w:rPr>
+                <w:b w:val="0"/>
+                <w:i w:val="0"/>
+                <w:color w:val="0B0B0B"/>
+                <w:sz w:val="17"/>
+              </w:rPr>
+              <w:t>23.22 °C</w:t>
+            </w:r>
+          </w:p>
+        </w:tc>
+        <w:tc>
+          <w:tcPr>
+            <w:tcW w:type="dxa" w:w="1360"/>
+          </w:tcPr>
+          <w:p>
+            <w:pPr>
+              <w:spacing w:after="40"/>
+            </w:pPr>
+            <w:r>
+              <w:rPr>
+                <w:b w:val="0"/>
+                <w:i w:val="0"/>
+                <w:color w:val="0B0B0B"/>
+                <w:sz w:val="17"/>
+              </w:rPr>
+              <w:t>33.74 °C</w:t>
+            </w:r>
+          </w:p>
+        </w:tc>
+        <w:tc>
+          <w:tcPr>
+            <w:tcW w:type="dxa" w:w="1360"/>
+          </w:tcPr>
+          <w:p>
+            <w:pPr>
+              <w:spacing w:after="40"/>
+            </w:pPr>
+            <w:r>
+              <w:rPr>
+                <w:b w:val="0"/>
+                <w:i w:val="0"/>
+                <w:color w:val="0B0B0B"/>
+                <w:sz w:val="17"/>
+              </w:rPr>
+              <w:t>10.52 K</w:t>
+            </w:r>
+          </w:p>
+        </w:tc>
+        <w:tc>
+          <w:tcPr>
+            <w:tcW w:type="dxa" w:w="1360"/>
+          </w:tcPr>
+          <w:p>
+            <w:pPr>
+              <w:spacing w:after="40"/>
+            </w:pPr>
+            <w:r>
+              <w:rPr>
+                <w:b w:val="0"/>
+                <w:i w:val="0"/>
+                <w:color w:val="0B0B0B"/>
+                <w:sz w:val="17"/>
+              </w:rPr>
+              <w:t>within ASHRAE recommended (18.0-27.0 degC)</w:t>
+            </w:r>
+          </w:p>
+        </w:tc>
+      </w:tr>
+      <w:tr>
+        <w:tc>
+          <w:tcPr>
+            <w:tcW w:type="dxa" w:w="1360"/>
+          </w:tcPr>
+          <w:p>
+            <w:pPr>
+              <w:spacing w:after="40"/>
+            </w:pPr>
+            <w:r>
+              <w:rPr>
+                <w:b w:val="0"/>
+                <w:i w:val="0"/>
+                <w:color w:val="0B0B0B"/>
+                <w:sz w:val="17"/>
+              </w:rPr>
+              <w:t>F6B1-20</w:t>
+            </w:r>
+          </w:p>
+        </w:tc>
+        <w:tc>
+          <w:tcPr>
+            <w:tcW w:type="dxa" w:w="1360"/>
+          </w:tcPr>
+          <w:p>
+            <w:pPr>
+              <w:spacing w:after="40"/>
+            </w:pPr>
+            <w:r>
+              <w:rPr>
+                <w:b w:val="0"/>
+                <w:i w:val="0"/>
+                <w:color w:val="0B0B0B"/>
+                <w:sz w:val="17"/>
+              </w:rPr>
+              <w:t>F6B1</w:t>
+            </w:r>
+          </w:p>
+        </w:tc>
+        <w:tc>
+          <w:tcPr>
+            <w:tcW w:type="dxa" w:w="1360"/>
+          </w:tcPr>
+          <w:p>
+            <w:pPr>
+              <w:spacing w:after="40"/>
+            </w:pPr>
+            <w:r>
+              <w:rPr>
+                <w:b w:val="0"/>
+                <w:i w:val="0"/>
+                <w:color w:val="0B0B0B"/>
+                <w:sz w:val="17"/>
+              </w:rPr>
+              <w:t>22.44 °C</w:t>
+            </w:r>
+          </w:p>
+        </w:tc>
+        <w:tc>
+          <w:tcPr>
+            <w:tcW w:type="dxa" w:w="1360"/>
+          </w:tcPr>
+          <w:p>
+            <w:pPr>
+              <w:spacing w:after="40"/>
+            </w:pPr>
+            <w:r>
+              <w:rPr>
+                <w:b w:val="0"/>
+                <w:i w:val="0"/>
+                <w:color w:val="0B0B0B"/>
+                <w:sz w:val="17"/>
+              </w:rPr>
+              <w:t>23.07 °C</w:t>
+            </w:r>
+          </w:p>
+        </w:tc>
+        <w:tc>
+          <w:tcPr>
+            <w:tcW w:type="dxa" w:w="1360"/>
+          </w:tcPr>
+          <w:p>
+            <w:pPr>
+              <w:spacing w:after="40"/>
+            </w:pPr>
+            <w:r>
+              <w:rPr>
+                <w:b w:val="0"/>
+                <w:i w:val="0"/>
+                <w:color w:val="0B0B0B"/>
+                <w:sz w:val="17"/>
+              </w:rPr>
+              <w:t>33.70 °C</w:t>
+            </w:r>
+          </w:p>
+        </w:tc>
+        <w:tc>
+          <w:tcPr>
+            <w:tcW w:type="dxa" w:w="1360"/>
+          </w:tcPr>
+          <w:p>
+            <w:pPr>
+              <w:spacing w:after="40"/>
+            </w:pPr>
+            <w:r>
+              <w:rPr>
+                <w:b w:val="0"/>
+                <w:i w:val="0"/>
+                <w:color w:val="0B0B0B"/>
+                <w:sz w:val="17"/>
+              </w:rPr>
+              <w:t>10.63 K</w:t>
+            </w:r>
+          </w:p>
+        </w:tc>
+        <w:tc>
+          <w:tcPr>
+            <w:tcW w:type="dxa" w:w="1360"/>
+          </w:tcPr>
+          <w:p>
+            <w:pPr>
+              <w:spacing w:after="40"/>
+            </w:pPr>
+            <w:r>
+              <w:rPr>
+                <w:b w:val="0"/>
+                <w:i w:val="0"/>
+                <w:color w:val="0B0B0B"/>
+                <w:sz w:val="17"/>
+              </w:rPr>
+              <w:t>within ASHRAE recommended (18.0-27.0 degC)</w:t>
+            </w:r>
+          </w:p>
+        </w:tc>
+      </w:tr>
+      <w:tr>
+        <w:tc>
+          <w:tcPr>
+            <w:tcW w:type="dxa" w:w="1360"/>
+          </w:tcPr>
+          <w:p>
+            <w:pPr>
+              <w:spacing w:after="40"/>
+            </w:pPr>
+            <w:r>
+              <w:rPr>
+                <w:b w:val="0"/>
+                <w:i w:val="0"/>
+                <w:color w:val="0B0B0B"/>
+                <w:sz w:val="17"/>
+              </w:rPr>
+              <w:t>F6B2-05</w:t>
+            </w:r>
+          </w:p>
+        </w:tc>
+        <w:tc>
+          <w:tcPr>
+            <w:tcW w:type="dxa" w:w="1360"/>
+          </w:tcPr>
+          <w:p>
+            <w:pPr>
+              <w:spacing w:after="40"/>
+            </w:pPr>
+            <w:r>
+              <w:rPr>
+                <w:b w:val="0"/>
+                <w:i w:val="0"/>
+                <w:color w:val="0B0B0B"/>
+                <w:sz w:val="17"/>
+              </w:rPr>
+              <w:t>F6B2</w:t>
+            </w:r>
+          </w:p>
+        </w:tc>
+        <w:tc>
+          <w:tcPr>
+            <w:tcW w:type="dxa" w:w="1360"/>
+          </w:tcPr>
+          <w:p>
+            <w:pPr>
+              <w:spacing w:after="40"/>
+            </w:pPr>
+            <w:r>
+              <w:rPr>
+                <w:b w:val="0"/>
+                <w:i w:val="0"/>
+                <w:color w:val="0B0B0B"/>
+                <w:sz w:val="17"/>
+              </w:rPr>
+              <w:t>22.44 °C</w:t>
+            </w:r>
+          </w:p>
+        </w:tc>
+        <w:tc>
+          <w:tcPr>
+            <w:tcW w:type="dxa" w:w="1360"/>
+          </w:tcPr>
+          <w:p>
+            <w:pPr>
+              <w:spacing w:after="40"/>
+            </w:pPr>
+            <w:r>
+              <w:rPr>
+                <w:b w:val="0"/>
+                <w:i w:val="0"/>
+                <w:color w:val="0B0B0B"/>
+                <w:sz w:val="17"/>
+              </w:rPr>
+              <w:t>23.21 °C</w:t>
+            </w:r>
+          </w:p>
+        </w:tc>
+        <w:tc>
+          <w:tcPr>
+            <w:tcW w:type="dxa" w:w="1360"/>
+          </w:tcPr>
+          <w:p>
+            <w:pPr>
+              <w:spacing w:after="40"/>
+            </w:pPr>
+            <w:r>
+              <w:rPr>
+                <w:b w:val="0"/>
+                <w:i w:val="0"/>
+                <w:color w:val="0B0B0B"/>
+                <w:sz w:val="17"/>
+              </w:rPr>
+              <w:t>33.76 °C</w:t>
             </w:r>
           </w:p>
         </w:tc>
@@ -4186,7 +5036,7 @@
                 <w:color w:val="0B0B0B"/>
                 <w:sz w:val="17"/>
               </w:rPr>
-              <w:t>22.41 °C</w:t>
+              <w:t>22.43 °C</w:t>
             </w:r>
           </w:p>
         </w:tc>
@@ -4205,7 +5055,7 @@
                 <w:color w:val="0B0B0B"/>
                 <w:sz w:val="17"/>
               </w:rPr>
-              <w:t>23.01 °C</w:t>
+              <w:t>22.99 °C</w:t>
             </w:r>
           </w:p>
         </w:tc>
@@ -4243,7 +5093,142 @@
                 <w:color w:val="0B0B0B"/>
                 <w:sz w:val="17"/>
               </w:rPr>
-              <w:t>10.66 K</w:t>
+              <w:t>10.68 K</w:t>
+            </w:r>
+          </w:p>
+        </w:tc>
+        <w:tc>
+          <w:tcPr>
+            <w:tcW w:type="dxa" w:w="1360"/>
+          </w:tcPr>
+          <w:p>
+            <w:pPr>
+              <w:spacing w:after="40"/>
+            </w:pPr>
+            <w:r>
+              <w:rPr>
+                <w:b w:val="0"/>
+                <w:i w:val="0"/>
+                <w:color w:val="0B0B0B"/>
+                <w:sz w:val="17"/>
+              </w:rPr>
+              <w:t>within ASHRAE recommended (18.0-27.0 degC)</w:t>
+            </w:r>
+          </w:p>
+        </w:tc>
+      </w:tr>
+      <w:tr>
+        <w:tc>
+          <w:tcPr>
+            <w:tcW w:type="dxa" w:w="1360"/>
+          </w:tcPr>
+          <w:p>
+            <w:pPr>
+              <w:spacing w:after="40"/>
+            </w:pPr>
+            <w:r>
+              <w:rPr>
+                <w:b w:val="0"/>
+                <w:i w:val="0"/>
+                <w:color w:val="0B0B0B"/>
+                <w:sz w:val="17"/>
+              </w:rPr>
+              <w:t>F6B2-03</w:t>
+            </w:r>
+          </w:p>
+        </w:tc>
+        <w:tc>
+          <w:tcPr>
+            <w:tcW w:type="dxa" w:w="1360"/>
+          </w:tcPr>
+          <w:p>
+            <w:pPr>
+              <w:spacing w:after="40"/>
+            </w:pPr>
+            <w:r>
+              <w:rPr>
+                <w:b w:val="0"/>
+                <w:i w:val="0"/>
+                <w:color w:val="0B0B0B"/>
+                <w:sz w:val="17"/>
+              </w:rPr>
+              <w:t>F6B2</w:t>
+            </w:r>
+          </w:p>
+        </w:tc>
+        <w:tc>
+          <w:tcPr>
+            <w:tcW w:type="dxa" w:w="1360"/>
+          </w:tcPr>
+          <w:p>
+            <w:pPr>
+              <w:spacing w:after="40"/>
+            </w:pPr>
+            <w:r>
+              <w:rPr>
+                <w:b w:val="0"/>
+                <w:i w:val="0"/>
+                <w:color w:val="0B0B0B"/>
+                <w:sz w:val="17"/>
+              </w:rPr>
+              <w:t>22.42 °C</w:t>
+            </w:r>
+          </w:p>
+        </w:tc>
+        <w:tc>
+          <w:tcPr>
+            <w:tcW w:type="dxa" w:w="1360"/>
+          </w:tcPr>
+          <w:p>
+            <w:pPr>
+              <w:spacing w:after="40"/>
+            </w:pPr>
+            <w:r>
+              <w:rPr>
+                <w:b w:val="0"/>
+                <w:i w:val="0"/>
+                <w:color w:val="0B0B0B"/>
+                <w:sz w:val="17"/>
+              </w:rPr>
+              <w:t>23.08 °C</w:t>
+            </w:r>
+          </w:p>
+        </w:tc>
+        <w:tc>
+          <w:tcPr>
+            <w:tcW w:type="dxa" w:w="1360"/>
+          </w:tcPr>
+          <w:p>
+            <w:pPr>
+              <w:spacing w:after="40"/>
+            </w:pPr>
+            <w:r>
+              <w:rPr>
+                <w:b w:val="0"/>
+                <w:i w:val="0"/>
+                <w:color w:val="0B0B0B"/>
+                <w:sz w:val="17"/>
+              </w:rPr>
+              <w:t>33.69 °C</w:t>
+            </w:r>
+          </w:p>
+        </w:tc>
+        <w:tc>
+          <w:tcPr>
+            <w:tcW w:type="dxa" w:w="1360"/>
+          </w:tcPr>
+          <w:p>
+            <w:pPr>
+              <w:spacing w:after="40"/>
+            </w:pPr>
+            <w:r>
+              <w:rPr>
+                <w:b w:val="0"/>
+                <w:i w:val="0"/>
+                <w:color w:val="0B0B0B"/>
+                <w:sz w:val="17"/>
+              </w:rPr>
+              <w:t>10.61 K</w:t>
             </w:r>
           </w:p>
         </w:tc>
@@ -4321,7 +5306,7 @@
                 <w:color w:val="0B0B0B"/>
                 <w:sz w:val="17"/>
               </w:rPr>
-              <w:t>22.40 °C</w:t>
+              <w:t>22.41 °C</w:t>
             </w:r>
           </w:p>
         </w:tc>
@@ -4340,7 +5325,7 @@
                 <w:color w:val="0B0B0B"/>
                 <w:sz w:val="17"/>
               </w:rPr>
-              <w:t>23.21 °C</w:t>
+              <w:t>23.20 °C</w:t>
             </w:r>
           </w:p>
         </w:tc>
@@ -4378,7 +5363,7 @@
                 <w:color w:val="0B0B0B"/>
                 <w:sz w:val="17"/>
               </w:rPr>
-              <w:t>10.52 K</w:t>
+              <w:t>10.53 K</w:t>
             </w:r>
           </w:p>
         </w:tc>
@@ -4418,7 +5403,7 @@
                 <w:color w:val="0B0B0B"/>
                 <w:sz w:val="17"/>
               </w:rPr>
-              <w:t>F6B1-20</w:t>
+              <w:t>F6B1-19</w:t>
             </w:r>
           </w:p>
         </w:tc>
@@ -4475,141 +5460,6 @@
                 <w:color w:val="0B0B0B"/>
                 <w:sz w:val="17"/>
               </w:rPr>
-              <w:t>23.06 °C</w:t>
-            </w:r>
-          </w:p>
-        </w:tc>
-        <w:tc>
-          <w:tcPr>
-            <w:tcW w:type="dxa" w:w="1360"/>
-          </w:tcPr>
-          <w:p>
-            <w:pPr>
-              <w:spacing w:after="40"/>
-            </w:pPr>
-            <w:r>
-              <w:rPr>
-                <w:b w:val="0"/>
-                <w:i w:val="0"/>
-                <w:color w:val="0B0B0B"/>
-                <w:sz w:val="17"/>
-              </w:rPr>
-              <w:t>33.70 °C</w:t>
-            </w:r>
-          </w:p>
-        </w:tc>
-        <w:tc>
-          <w:tcPr>
-            <w:tcW w:type="dxa" w:w="1360"/>
-          </w:tcPr>
-          <w:p>
-            <w:pPr>
-              <w:spacing w:after="40"/>
-            </w:pPr>
-            <w:r>
-              <w:rPr>
-                <w:b w:val="0"/>
-                <w:i w:val="0"/>
-                <w:color w:val="0B0B0B"/>
-                <w:sz w:val="17"/>
-              </w:rPr>
-              <w:t>10.64 K</w:t>
-            </w:r>
-          </w:p>
-        </w:tc>
-        <w:tc>
-          <w:tcPr>
-            <w:tcW w:type="dxa" w:w="1360"/>
-          </w:tcPr>
-          <w:p>
-            <w:pPr>
-              <w:spacing w:after="40"/>
-            </w:pPr>
-            <w:r>
-              <w:rPr>
-                <w:b w:val="0"/>
-                <w:i w:val="0"/>
-                <w:color w:val="0B0B0B"/>
-                <w:sz w:val="17"/>
-              </w:rPr>
-              <w:t>within ASHRAE recommended (18.0-27.0 degC)</w:t>
-            </w:r>
-          </w:p>
-        </w:tc>
-      </w:tr>
-      <w:tr>
-        <w:tc>
-          <w:tcPr>
-            <w:tcW w:type="dxa" w:w="1360"/>
-          </w:tcPr>
-          <w:p>
-            <w:pPr>
-              <w:spacing w:after="40"/>
-            </w:pPr>
-            <w:r>
-              <w:rPr>
-                <w:b w:val="0"/>
-                <w:i w:val="0"/>
-                <w:color w:val="0B0B0B"/>
-                <w:sz w:val="17"/>
-              </w:rPr>
-              <w:t>F3B1-15</w:t>
-            </w:r>
-          </w:p>
-        </w:tc>
-        <w:tc>
-          <w:tcPr>
-            <w:tcW w:type="dxa" w:w="1360"/>
-          </w:tcPr>
-          <w:p>
-            <w:pPr>
-              <w:spacing w:after="40"/>
-            </w:pPr>
-            <w:r>
-              <w:rPr>
-                <w:b w:val="0"/>
-                <w:i w:val="0"/>
-                <w:color w:val="0B0B0B"/>
-                <w:sz w:val="17"/>
-              </w:rPr>
-              <w:t>F3B1</w:t>
-            </w:r>
-          </w:p>
-        </w:tc>
-        <w:tc>
-          <w:tcPr>
-            <w:tcW w:type="dxa" w:w="1360"/>
-          </w:tcPr>
-          <w:p>
-            <w:pPr>
-              <w:spacing w:after="40"/>
-            </w:pPr>
-            <w:r>
-              <w:rPr>
-                <w:b w:val="0"/>
-                <w:i w:val="0"/>
-                <w:color w:val="0B0B0B"/>
-                <w:sz w:val="17"/>
-              </w:rPr>
-              <w:t>22.37 °C</w:t>
-            </w:r>
-          </w:p>
-        </w:tc>
-        <w:tc>
-          <w:tcPr>
-            <w:tcW w:type="dxa" w:w="1360"/>
-          </w:tcPr>
-          <w:p>
-            <w:pPr>
-              <w:spacing w:after="40"/>
-            </w:pPr>
-            <w:r>
-              <w:rPr>
-                <w:b w:val="0"/>
-                <w:i w:val="0"/>
-                <w:color w:val="0B0B0B"/>
-                <w:sz w:val="17"/>
-              </w:rPr>
               <w:t>23.11 °C</w:t>
             </w:r>
           </w:p>
@@ -4629,7 +5479,7 @@
                 <w:color w:val="0B0B0B"/>
                 <w:sz w:val="17"/>
               </w:rPr>
-              <w:t>33.61 °C</w:t>
+              <w:t>33.73 °C</w:t>
             </w:r>
           </w:p>
         </w:tc>
@@ -4648,142 +5498,7 @@
                 <w:color w:val="0B0B0B"/>
                 <w:sz w:val="17"/>
               </w:rPr>
-              <w:t>10.50 K</w:t>
-            </w:r>
-          </w:p>
-        </w:tc>
-        <w:tc>
-          <w:tcPr>
-            <w:tcW w:type="dxa" w:w="1360"/>
-          </w:tcPr>
-          <w:p>
-            <w:pPr>
-              <w:spacing w:after="40"/>
-            </w:pPr>
-            <w:r>
-              <w:rPr>
-                <w:b w:val="0"/>
-                <w:i w:val="0"/>
-                <w:color w:val="0B0B0B"/>
-                <w:sz w:val="17"/>
-              </w:rPr>
-              <w:t>within ASHRAE recommended (18.0-27.0 degC)</w:t>
-            </w:r>
-          </w:p>
-        </w:tc>
-      </w:tr>
-      <w:tr>
-        <w:tc>
-          <w:tcPr>
-            <w:tcW w:type="dxa" w:w="1360"/>
-          </w:tcPr>
-          <w:p>
-            <w:pPr>
-              <w:spacing w:after="40"/>
-            </w:pPr>
-            <w:r>
-              <w:rPr>
-                <w:b w:val="0"/>
-                <w:i w:val="0"/>
-                <w:color w:val="0B0B0B"/>
-                <w:sz w:val="17"/>
-              </w:rPr>
-              <w:t>F3B1-16</w:t>
-            </w:r>
-          </w:p>
-        </w:tc>
-        <w:tc>
-          <w:tcPr>
-            <w:tcW w:type="dxa" w:w="1360"/>
-          </w:tcPr>
-          <w:p>
-            <w:pPr>
-              <w:spacing w:after="40"/>
-            </w:pPr>
-            <w:r>
-              <w:rPr>
-                <w:b w:val="0"/>
-                <w:i w:val="0"/>
-                <w:color w:val="0B0B0B"/>
-                <w:sz w:val="17"/>
-              </w:rPr>
-              <w:t>F3B1</w:t>
-            </w:r>
-          </w:p>
-        </w:tc>
-        <w:tc>
-          <w:tcPr>
-            <w:tcW w:type="dxa" w:w="1360"/>
-          </w:tcPr>
-          <w:p>
-            <w:pPr>
-              <w:spacing w:after="40"/>
-            </w:pPr>
-            <w:r>
-              <w:rPr>
-                <w:b w:val="0"/>
-                <w:i w:val="0"/>
-                <w:color w:val="0B0B0B"/>
-                <w:sz w:val="17"/>
-              </w:rPr>
-              <w:t>22.37 °C</w:t>
-            </w:r>
-          </w:p>
-        </w:tc>
-        <w:tc>
-          <w:tcPr>
-            <w:tcW w:type="dxa" w:w="1360"/>
-          </w:tcPr>
-          <w:p>
-            <w:pPr>
-              <w:spacing w:after="40"/>
-            </w:pPr>
-            <w:r>
-              <w:rPr>
-                <w:b w:val="0"/>
-                <w:i w:val="0"/>
-                <w:color w:val="0B0B0B"/>
-                <w:sz w:val="17"/>
-              </w:rPr>
-              <w:t>23.15 °C</w:t>
-            </w:r>
-          </w:p>
-        </w:tc>
-        <w:tc>
-          <w:tcPr>
-            <w:tcW w:type="dxa" w:w="1360"/>
-          </w:tcPr>
-          <w:p>
-            <w:pPr>
-              <w:spacing w:after="40"/>
-            </w:pPr>
-            <w:r>
-              <w:rPr>
-                <w:b w:val="0"/>
-                <w:i w:val="0"/>
-                <w:color w:val="0B0B0B"/>
-                <w:sz w:val="17"/>
-              </w:rPr>
-              <w:t>33.64 °C</w:t>
-            </w:r>
-          </w:p>
-        </w:tc>
-        <w:tc>
-          <w:tcPr>
-            <w:tcW w:type="dxa" w:w="1360"/>
-          </w:tcPr>
-          <w:p>
-            <w:pPr>
-              <w:spacing w:after="40"/>
-            </w:pPr>
-            <w:r>
-              <w:rPr>
-                <w:b w:val="0"/>
-                <w:i w:val="0"/>
-                <w:color w:val="0B0B0B"/>
-                <w:sz w:val="17"/>
-              </w:rPr>
-              <w:t>10.49 K</w:t>
+              <w:t>10.62 K</w:t>
             </w:r>
           </w:p>
         </w:tc>
@@ -4861,7 +5576,7 @@
                 <w:color w:val="0B0B0B"/>
                 <w:sz w:val="17"/>
               </w:rPr>
-              <w:t>22.36 °C</w:t>
+              <w:t>22.38 °C</w:t>
             </w:r>
           </w:p>
         </w:tc>
@@ -4880,7 +5595,7 @@
                 <w:color w:val="0B0B0B"/>
                 <w:sz w:val="17"/>
               </w:rPr>
-              <w:t>22.86 °C</w:t>
+              <w:t>22.85 °C</w:t>
             </w:r>
           </w:p>
         </w:tc>
@@ -4899,7 +5614,7 @@
                 <w:color w:val="0B0B0B"/>
                 <w:sz w:val="17"/>
               </w:rPr>
-              <w:t>33.64 °C</w:t>
+              <w:t>33.63 °C</w:t>
             </w:r>
           </w:p>
         </w:tc>
@@ -4919,681 +5634,6 @@
                 <w:sz w:val="17"/>
               </w:rPr>
               <w:t>10.78 K</w:t>
-            </w:r>
-          </w:p>
-        </w:tc>
-        <w:tc>
-          <w:tcPr>
-            <w:tcW w:type="dxa" w:w="1360"/>
-          </w:tcPr>
-          <w:p>
-            <w:pPr>
-              <w:spacing w:after="40"/>
-            </w:pPr>
-            <w:r>
-              <w:rPr>
-                <w:b w:val="0"/>
-                <w:i w:val="0"/>
-                <w:color w:val="0B0B0B"/>
-                <w:sz w:val="17"/>
-              </w:rPr>
-              <w:t>within ASHRAE recommended (18.0-27.0 degC)</w:t>
-            </w:r>
-          </w:p>
-        </w:tc>
-      </w:tr>
-      <w:tr>
-        <w:tc>
-          <w:tcPr>
-            <w:tcW w:type="dxa" w:w="1360"/>
-          </w:tcPr>
-          <w:p>
-            <w:pPr>
-              <w:spacing w:after="40"/>
-            </w:pPr>
-            <w:r>
-              <w:rPr>
-                <w:b w:val="0"/>
-                <w:i w:val="0"/>
-                <w:color w:val="0B0B0B"/>
-                <w:sz w:val="17"/>
-              </w:rPr>
-              <w:t>F6B2-05</w:t>
-            </w:r>
-          </w:p>
-        </w:tc>
-        <w:tc>
-          <w:tcPr>
-            <w:tcW w:type="dxa" w:w="1360"/>
-          </w:tcPr>
-          <w:p>
-            <w:pPr>
-              <w:spacing w:after="40"/>
-            </w:pPr>
-            <w:r>
-              <w:rPr>
-                <w:b w:val="0"/>
-                <w:i w:val="0"/>
-                <w:color w:val="0B0B0B"/>
-                <w:sz w:val="17"/>
-              </w:rPr>
-              <w:t>F6B2</w:t>
-            </w:r>
-          </w:p>
-        </w:tc>
-        <w:tc>
-          <w:tcPr>
-            <w:tcW w:type="dxa" w:w="1360"/>
-          </w:tcPr>
-          <w:p>
-            <w:pPr>
-              <w:spacing w:after="40"/>
-            </w:pPr>
-            <w:r>
-              <w:rPr>
-                <w:b w:val="0"/>
-                <w:i w:val="0"/>
-                <w:color w:val="0B0B0B"/>
-                <w:sz w:val="17"/>
-              </w:rPr>
-              <w:t>22.36 °C</w:t>
-            </w:r>
-          </w:p>
-        </w:tc>
-        <w:tc>
-          <w:tcPr>
-            <w:tcW w:type="dxa" w:w="1360"/>
-          </w:tcPr>
-          <w:p>
-            <w:pPr>
-              <w:spacing w:after="40"/>
-            </w:pPr>
-            <w:r>
-              <w:rPr>
-                <w:b w:val="0"/>
-                <w:i w:val="0"/>
-                <w:color w:val="0B0B0B"/>
-                <w:sz w:val="17"/>
-              </w:rPr>
-              <w:t>23.17 °C</w:t>
-            </w:r>
-          </w:p>
-        </w:tc>
-        <w:tc>
-          <w:tcPr>
-            <w:tcW w:type="dxa" w:w="1360"/>
-          </w:tcPr>
-          <w:p>
-            <w:pPr>
-              <w:spacing w:after="40"/>
-            </w:pPr>
-            <w:r>
-              <w:rPr>
-                <w:b w:val="0"/>
-                <w:i w:val="0"/>
-                <w:color w:val="0B0B0B"/>
-                <w:sz w:val="17"/>
-              </w:rPr>
-              <w:t>33.75 °C</w:t>
-            </w:r>
-          </w:p>
-        </w:tc>
-        <w:tc>
-          <w:tcPr>
-            <w:tcW w:type="dxa" w:w="1360"/>
-          </w:tcPr>
-          <w:p>
-            <w:pPr>
-              <w:spacing w:after="40"/>
-            </w:pPr>
-            <w:r>
-              <w:rPr>
-                <w:b w:val="0"/>
-                <w:i w:val="0"/>
-                <w:color w:val="0B0B0B"/>
-                <w:sz w:val="17"/>
-              </w:rPr>
-              <w:t>10.58 K</w:t>
-            </w:r>
-          </w:p>
-        </w:tc>
-        <w:tc>
-          <w:tcPr>
-            <w:tcW w:type="dxa" w:w="1360"/>
-          </w:tcPr>
-          <w:p>
-            <w:pPr>
-              <w:spacing w:after="40"/>
-            </w:pPr>
-            <w:r>
-              <w:rPr>
-                <w:b w:val="0"/>
-                <w:i w:val="0"/>
-                <w:color w:val="0B0B0B"/>
-                <w:sz w:val="17"/>
-              </w:rPr>
-              <w:t>within ASHRAE recommended (18.0-27.0 degC)</w:t>
-            </w:r>
-          </w:p>
-        </w:tc>
-      </w:tr>
-      <w:tr>
-        <w:tc>
-          <w:tcPr>
-            <w:tcW w:type="dxa" w:w="1360"/>
-          </w:tcPr>
-          <w:p>
-            <w:pPr>
-              <w:spacing w:after="40"/>
-            </w:pPr>
-            <w:r>
-              <w:rPr>
-                <w:b w:val="0"/>
-                <w:i w:val="0"/>
-                <w:color w:val="0B0B0B"/>
-                <w:sz w:val="17"/>
-              </w:rPr>
-              <w:t>F6B2-04</w:t>
-            </w:r>
-          </w:p>
-        </w:tc>
-        <w:tc>
-          <w:tcPr>
-            <w:tcW w:type="dxa" w:w="1360"/>
-          </w:tcPr>
-          <w:p>
-            <w:pPr>
-              <w:spacing w:after="40"/>
-            </w:pPr>
-            <w:r>
-              <w:rPr>
-                <w:b w:val="0"/>
-                <w:i w:val="0"/>
-                <w:color w:val="0B0B0B"/>
-                <w:sz w:val="17"/>
-              </w:rPr>
-              <w:t>F6B2</w:t>
-            </w:r>
-          </w:p>
-        </w:tc>
-        <w:tc>
-          <w:tcPr>
-            <w:tcW w:type="dxa" w:w="1360"/>
-          </w:tcPr>
-          <w:p>
-            <w:pPr>
-              <w:spacing w:after="40"/>
-            </w:pPr>
-            <w:r>
-              <w:rPr>
-                <w:b w:val="0"/>
-                <w:i w:val="0"/>
-                <w:color w:val="0B0B0B"/>
-                <w:sz w:val="17"/>
-              </w:rPr>
-              <w:t>22.35 °C</w:t>
-            </w:r>
-          </w:p>
-        </w:tc>
-        <w:tc>
-          <w:tcPr>
-            <w:tcW w:type="dxa" w:w="1360"/>
-          </w:tcPr>
-          <w:p>
-            <w:pPr>
-              <w:spacing w:after="40"/>
-            </w:pPr>
-            <w:r>
-              <w:rPr>
-                <w:b w:val="0"/>
-                <w:i w:val="0"/>
-                <w:color w:val="0B0B0B"/>
-                <w:sz w:val="17"/>
-              </w:rPr>
-              <w:t>23.14 °C</w:t>
-            </w:r>
-          </w:p>
-        </w:tc>
-        <w:tc>
-          <w:tcPr>
-            <w:tcW w:type="dxa" w:w="1360"/>
-          </w:tcPr>
-          <w:p>
-            <w:pPr>
-              <w:spacing w:after="40"/>
-            </w:pPr>
-            <w:r>
-              <w:rPr>
-                <w:b w:val="0"/>
-                <w:i w:val="0"/>
-                <w:color w:val="0B0B0B"/>
-                <w:sz w:val="17"/>
-              </w:rPr>
-              <w:t>33.72 °C</w:t>
-            </w:r>
-          </w:p>
-        </w:tc>
-        <w:tc>
-          <w:tcPr>
-            <w:tcW w:type="dxa" w:w="1360"/>
-          </w:tcPr>
-          <w:p>
-            <w:pPr>
-              <w:spacing w:after="40"/>
-            </w:pPr>
-            <w:r>
-              <w:rPr>
-                <w:b w:val="0"/>
-                <w:i w:val="0"/>
-                <w:color w:val="0B0B0B"/>
-                <w:sz w:val="17"/>
-              </w:rPr>
-              <w:t>10.58 K</w:t>
-            </w:r>
-          </w:p>
-        </w:tc>
-        <w:tc>
-          <w:tcPr>
-            <w:tcW w:type="dxa" w:w="1360"/>
-          </w:tcPr>
-          <w:p>
-            <w:pPr>
-              <w:spacing w:after="40"/>
-            </w:pPr>
-            <w:r>
-              <w:rPr>
-                <w:b w:val="0"/>
-                <w:i w:val="0"/>
-                <w:color w:val="0B0B0B"/>
-                <w:sz w:val="17"/>
-              </w:rPr>
-              <w:t>within ASHRAE recommended (18.0-27.0 degC)</w:t>
-            </w:r>
-          </w:p>
-        </w:tc>
-      </w:tr>
-      <w:tr>
-        <w:tc>
-          <w:tcPr>
-            <w:tcW w:type="dxa" w:w="1360"/>
-          </w:tcPr>
-          <w:p>
-            <w:pPr>
-              <w:spacing w:after="40"/>
-            </w:pPr>
-            <w:r>
-              <w:rPr>
-                <w:b w:val="0"/>
-                <w:i w:val="0"/>
-                <w:color w:val="0B0B0B"/>
-                <w:sz w:val="17"/>
-              </w:rPr>
-              <w:t>F3B1-17</w:t>
-            </w:r>
-          </w:p>
-        </w:tc>
-        <w:tc>
-          <w:tcPr>
-            <w:tcW w:type="dxa" w:w="1360"/>
-          </w:tcPr>
-          <w:p>
-            <w:pPr>
-              <w:spacing w:after="40"/>
-            </w:pPr>
-            <w:r>
-              <w:rPr>
-                <w:b w:val="0"/>
-                <w:i w:val="0"/>
-                <w:color w:val="0B0B0B"/>
-                <w:sz w:val="17"/>
-              </w:rPr>
-              <w:t>F3B1</w:t>
-            </w:r>
-          </w:p>
-        </w:tc>
-        <w:tc>
-          <w:tcPr>
-            <w:tcW w:type="dxa" w:w="1360"/>
-          </w:tcPr>
-          <w:p>
-            <w:pPr>
-              <w:spacing w:after="40"/>
-            </w:pPr>
-            <w:r>
-              <w:rPr>
-                <w:b w:val="0"/>
-                <w:i w:val="0"/>
-                <w:color w:val="0B0B0B"/>
-                <w:sz w:val="17"/>
-              </w:rPr>
-              <w:t>22.34 °C</w:t>
-            </w:r>
-          </w:p>
-        </w:tc>
-        <w:tc>
-          <w:tcPr>
-            <w:tcW w:type="dxa" w:w="1360"/>
-          </w:tcPr>
-          <w:p>
-            <w:pPr>
-              <w:spacing w:after="40"/>
-            </w:pPr>
-            <w:r>
-              <w:rPr>
-                <w:b w:val="0"/>
-                <w:i w:val="0"/>
-                <w:color w:val="0B0B0B"/>
-                <w:sz w:val="17"/>
-              </w:rPr>
-              <w:t>23.16 °C</w:t>
-            </w:r>
-          </w:p>
-        </w:tc>
-        <w:tc>
-          <w:tcPr>
-            <w:tcW w:type="dxa" w:w="1360"/>
-          </w:tcPr>
-          <w:p>
-            <w:pPr>
-              <w:spacing w:after="40"/>
-            </w:pPr>
-            <w:r>
-              <w:rPr>
-                <w:b w:val="0"/>
-                <w:i w:val="0"/>
-                <w:color w:val="0B0B0B"/>
-                <w:sz w:val="17"/>
-              </w:rPr>
-              <w:t>33.65 °C</w:t>
-            </w:r>
-          </w:p>
-        </w:tc>
-        <w:tc>
-          <w:tcPr>
-            <w:tcW w:type="dxa" w:w="1360"/>
-          </w:tcPr>
-          <w:p>
-            <w:pPr>
-              <w:spacing w:after="40"/>
-            </w:pPr>
-            <w:r>
-              <w:rPr>
-                <w:b w:val="0"/>
-                <w:i w:val="0"/>
-                <w:color w:val="0B0B0B"/>
-                <w:sz w:val="17"/>
-              </w:rPr>
-              <w:t>10.49 K</w:t>
-            </w:r>
-          </w:p>
-        </w:tc>
-        <w:tc>
-          <w:tcPr>
-            <w:tcW w:type="dxa" w:w="1360"/>
-          </w:tcPr>
-          <w:p>
-            <w:pPr>
-              <w:spacing w:after="40"/>
-            </w:pPr>
-            <w:r>
-              <w:rPr>
-                <w:b w:val="0"/>
-                <w:i w:val="0"/>
-                <w:color w:val="0B0B0B"/>
-                <w:sz w:val="17"/>
-              </w:rPr>
-              <w:t>within ASHRAE recommended (18.0-27.0 degC)</w:t>
-            </w:r>
-          </w:p>
-        </w:tc>
-      </w:tr>
-      <w:tr>
-        <w:tc>
-          <w:tcPr>
-            <w:tcW w:type="dxa" w:w="1360"/>
-          </w:tcPr>
-          <w:p>
-            <w:pPr>
-              <w:spacing w:after="40"/>
-            </w:pPr>
-            <w:r>
-              <w:rPr>
-                <w:b w:val="0"/>
-                <w:i w:val="0"/>
-                <w:color w:val="0B0B0B"/>
-                <w:sz w:val="17"/>
-              </w:rPr>
-              <w:t>F1B2-07</w:t>
-            </w:r>
-          </w:p>
-        </w:tc>
-        <w:tc>
-          <w:tcPr>
-            <w:tcW w:type="dxa" w:w="1360"/>
-          </w:tcPr>
-          <w:p>
-            <w:pPr>
-              <w:spacing w:after="40"/>
-            </w:pPr>
-            <w:r>
-              <w:rPr>
-                <w:b w:val="0"/>
-                <w:i w:val="0"/>
-                <w:color w:val="0B0B0B"/>
-                <w:sz w:val="17"/>
-              </w:rPr>
-              <w:t>F1B2</w:t>
-            </w:r>
-          </w:p>
-        </w:tc>
-        <w:tc>
-          <w:tcPr>
-            <w:tcW w:type="dxa" w:w="1360"/>
-          </w:tcPr>
-          <w:p>
-            <w:pPr>
-              <w:spacing w:after="40"/>
-            </w:pPr>
-            <w:r>
-              <w:rPr>
-                <w:b w:val="0"/>
-                <w:i w:val="0"/>
-                <w:color w:val="0B0B0B"/>
-                <w:sz w:val="17"/>
-              </w:rPr>
-              <w:t>22.33 °C</w:t>
-            </w:r>
-          </w:p>
-        </w:tc>
-        <w:tc>
-          <w:tcPr>
-            <w:tcW w:type="dxa" w:w="1360"/>
-          </w:tcPr>
-          <w:p>
-            <w:pPr>
-              <w:spacing w:after="40"/>
-            </w:pPr>
-            <w:r>
-              <w:rPr>
-                <w:b w:val="0"/>
-                <w:i w:val="0"/>
-                <w:color w:val="0B0B0B"/>
-                <w:sz w:val="17"/>
-              </w:rPr>
-              <w:t>22.88 °C</w:t>
-            </w:r>
-          </w:p>
-        </w:tc>
-        <w:tc>
-          <w:tcPr>
-            <w:tcW w:type="dxa" w:w="1360"/>
-          </w:tcPr>
-          <w:p>
-            <w:pPr>
-              <w:spacing w:after="40"/>
-            </w:pPr>
-            <w:r>
-              <w:rPr>
-                <w:b w:val="0"/>
-                <w:i w:val="0"/>
-                <w:color w:val="0B0B0B"/>
-                <w:sz w:val="17"/>
-              </w:rPr>
-              <w:t>33.57 °C</w:t>
-            </w:r>
-          </w:p>
-        </w:tc>
-        <w:tc>
-          <w:tcPr>
-            <w:tcW w:type="dxa" w:w="1360"/>
-          </w:tcPr>
-          <w:p>
-            <w:pPr>
-              <w:spacing w:after="40"/>
-            </w:pPr>
-            <w:r>
-              <w:rPr>
-                <w:b w:val="0"/>
-                <w:i w:val="0"/>
-                <w:color w:val="0B0B0B"/>
-                <w:sz w:val="17"/>
-              </w:rPr>
-              <w:t>10.69 K</w:t>
-            </w:r>
-          </w:p>
-        </w:tc>
-        <w:tc>
-          <w:tcPr>
-            <w:tcW w:type="dxa" w:w="1360"/>
-          </w:tcPr>
-          <w:p>
-            <w:pPr>
-              <w:spacing w:after="40"/>
-            </w:pPr>
-            <w:r>
-              <w:rPr>
-                <w:b w:val="0"/>
-                <w:i w:val="0"/>
-                <w:color w:val="0B0B0B"/>
-                <w:sz w:val="17"/>
-              </w:rPr>
-              <w:t>within ASHRAE recommended (18.0-27.0 degC)</w:t>
-            </w:r>
-          </w:p>
-        </w:tc>
-      </w:tr>
-      <w:tr>
-        <w:tc>
-          <w:tcPr>
-            <w:tcW w:type="dxa" w:w="1360"/>
-          </w:tcPr>
-          <w:p>
-            <w:pPr>
-              <w:spacing w:after="40"/>
-            </w:pPr>
-            <w:r>
-              <w:rPr>
-                <w:b w:val="0"/>
-                <w:i w:val="0"/>
-                <w:color w:val="0B0B0B"/>
-                <w:sz w:val="17"/>
-              </w:rPr>
-              <w:t>F3B2-03</w:t>
-            </w:r>
-          </w:p>
-        </w:tc>
-        <w:tc>
-          <w:tcPr>
-            <w:tcW w:type="dxa" w:w="1360"/>
-          </w:tcPr>
-          <w:p>
-            <w:pPr>
-              <w:spacing w:after="40"/>
-            </w:pPr>
-            <w:r>
-              <w:rPr>
-                <w:b w:val="0"/>
-                <w:i w:val="0"/>
-                <w:color w:val="0B0B0B"/>
-                <w:sz w:val="17"/>
-              </w:rPr>
-              <w:t>F3B2</w:t>
-            </w:r>
-          </w:p>
-        </w:tc>
-        <w:tc>
-          <w:tcPr>
-            <w:tcW w:type="dxa" w:w="1360"/>
-          </w:tcPr>
-          <w:p>
-            <w:pPr>
-              <w:spacing w:after="40"/>
-            </w:pPr>
-            <w:r>
-              <w:rPr>
-                <w:b w:val="0"/>
-                <w:i w:val="0"/>
-                <w:color w:val="0B0B0B"/>
-                <w:sz w:val="17"/>
-              </w:rPr>
-              <w:t>22.33 °C</w:t>
-            </w:r>
-          </w:p>
-        </w:tc>
-        <w:tc>
-          <w:tcPr>
-            <w:tcW w:type="dxa" w:w="1360"/>
-          </w:tcPr>
-          <w:p>
-            <w:pPr>
-              <w:spacing w:after="40"/>
-            </w:pPr>
-            <w:r>
-              <w:rPr>
-                <w:b w:val="0"/>
-                <w:i w:val="0"/>
-                <w:color w:val="0B0B0B"/>
-                <w:sz w:val="17"/>
-              </w:rPr>
-              <w:t>23.01 °C</w:t>
-            </w:r>
-          </w:p>
-        </w:tc>
-        <w:tc>
-          <w:tcPr>
-            <w:tcW w:type="dxa" w:w="1360"/>
-          </w:tcPr>
-          <w:p>
-            <w:pPr>
-              <w:spacing w:after="40"/>
-            </w:pPr>
-            <w:r>
-              <w:rPr>
-                <w:b w:val="0"/>
-                <w:i w:val="0"/>
-                <w:color w:val="0B0B0B"/>
-                <w:sz w:val="17"/>
-              </w:rPr>
-              <w:t>33.66 °C</w:t>
-            </w:r>
-          </w:p>
-        </w:tc>
-        <w:tc>
-          <w:tcPr>
-            <w:tcW w:type="dxa" w:w="1360"/>
-          </w:tcPr>
-          <w:p>
-            <w:pPr>
-              <w:spacing w:after="40"/>
-            </w:pPr>
-            <w:r>
-              <w:rPr>
-                <w:b w:val="0"/>
-                <w:i w:val="0"/>
-                <w:color w:val="0B0B0B"/>
-                <w:sz w:val="17"/>
-              </w:rPr>
-              <w:t>10.65 K</w:t>
             </w:r>
           </w:p>
         </w:tc>
@@ -6118,7 +6158,7 @@
                 <w:color w:val="0B0B0B"/>
                 <w:sz w:val="17"/>
               </w:rPr>
-              <w:t>53.3 Pa</w:t>
+              <w:t>53.1 Pa</w:t>
             </w:r>
           </w:p>
         </w:tc>
@@ -6234,7 +6274,7 @@
                 <w:color w:val="0B0B0B"/>
                 <w:sz w:val="17"/>
               </w:rPr>
-              <w:t>55.4 Pa</w:t>
+              <w:t>55.8 Pa</w:t>
             </w:r>
           </w:p>
         </w:tc>
@@ -6274,7 +6314,7 @@
                 <w:color w:val="0B0B0B"/>
                 <w:sz w:val="17"/>
               </w:rPr>
-              <w:t>33.41 °C</w:t>
+              <w:t>33.40 °C</w:t>
             </w:r>
           </w:p>
         </w:tc>
@@ -6350,7 +6390,7 @@
                 <w:color w:val="0B0B0B"/>
                 <w:sz w:val="17"/>
               </w:rPr>
-              <w:t>53.1 Pa</w:t>
+              <w:t>53.0 Pa</w:t>
             </w:r>
           </w:p>
         </w:tc>
@@ -6466,7 +6506,7 @@
                 <w:color w:val="0B0B0B"/>
                 <w:sz w:val="17"/>
               </w:rPr>
-              <w:t>56.1 Pa</w:t>
+              <w:t>56.2 Pa</w:t>
             </w:r>
           </w:p>
         </w:tc>
@@ -6582,7 +6622,7 @@
                 <w:color w:val="0B0B0B"/>
                 <w:sz w:val="17"/>
               </w:rPr>
-              <w:t>53.0 Pa</w:t>
+              <w:t>53.2 Pa</w:t>
             </w:r>
           </w:p>
         </w:tc>
@@ -6698,7 +6738,7 @@
                 <w:color w:val="0B0B0B"/>
                 <w:sz w:val="17"/>
               </w:rPr>
-              <w:t>55.6 Pa</w:t>
+              <w:t>55.5 Pa</w:t>
             </w:r>
           </w:p>
         </w:tc>
@@ -6738,7 +6778,7 @@
                 <w:color w:val="0B0B0B"/>
                 <w:sz w:val="17"/>
               </w:rPr>
-              <w:t>33.34 °C</w:t>
+              <w:t>33.32 °C</w:t>
             </w:r>
           </w:p>
         </w:tc>
@@ -6776,7 +6816,7 @@
                 <w:color w:val="0B0B0B"/>
                 <w:sz w:val="17"/>
               </w:rPr>
-              <w:t>364 kW</w:t>
+              <w:t>363 kW</w:t>
             </w:r>
           </w:p>
         </w:tc>
@@ -6814,7 +6854,7 @@
                 <w:color w:val="0B0B0B"/>
                 <w:sz w:val="17"/>
               </w:rPr>
-              <w:t>54.7 Pa</w:t>
+              <w:t>54.6 Pa</w:t>
             </w:r>
           </w:p>
         </w:tc>
@@ -6854,7 +6894,7 @@
                 <w:color w:val="0B0B0B"/>
                 <w:sz w:val="17"/>
               </w:rPr>
-              <w:t>33.34 °C</w:t>
+              <w:t>33.33 °C</w:t>
             </w:r>
           </w:p>
         </w:tc>
@@ -6892,7 +6932,7 @@
                 <w:color w:val="0B0B0B"/>
                 <w:sz w:val="17"/>
               </w:rPr>
-              <w:t>364 kW</w:t>
+              <w:t>363 kW</w:t>
             </w:r>
           </w:p>
         </w:tc>
@@ -6930,7 +6970,7 @@
                 <w:color w:val="0B0B0B"/>
                 <w:sz w:val="17"/>
               </w:rPr>
-              <w:t>53.2 Pa</w:t>
+              <w:t>53.4 Pa</w:t>
             </w:r>
           </w:p>
         </w:tc>
@@ -6970,7 +7010,7 @@
                 <w:color w:val="0B0B0B"/>
                 <w:sz w:val="17"/>
               </w:rPr>
-              <w:t>33.36 °C</w:t>
+              <w:t>33.37 °C</w:t>
             </w:r>
           </w:p>
         </w:tc>
@@ -7278,7 +7318,7 @@
                 <w:color w:val="0B0B0B"/>
                 <w:sz w:val="17"/>
               </w:rPr>
-              <w:t>54.6 Pa</w:t>
+              <w:t>54.8 Pa</w:t>
             </w:r>
           </w:p>
         </w:tc>
@@ -7318,7 +7358,7 @@
                 <w:color w:val="0B0B0B"/>
                 <w:sz w:val="17"/>
               </w:rPr>
-              <w:t>33.34 °C</w:t>
+              <w:t>33.35 °C</w:t>
             </w:r>
           </w:p>
         </w:tc>
@@ -7510,7 +7550,7 @@
                 <w:color w:val="0B0B0B"/>
                 <w:sz w:val="17"/>
               </w:rPr>
-              <w:t>55.5 Pa</w:t>
+              <w:t>55.7 Pa</w:t>
             </w:r>
           </w:p>
         </w:tc>
@@ -7567,7 +7607,7 @@
           <w:color w:val="0B0B0B"/>
           <w:sz w:val="20"/>
         </w:rPr>
-        <w:t>The air delivered to the IT equipment is within the ASHRAE class A1 recommended range. The warmest rack intake is 22.43 °C at rack F5B2-04, measured at the top of the rack, leaving 4.57 K of margin against the 27 °C recommended limit.</w:t>
+        <w:t>The air delivered to the IT equipment is within the ASHRAE class A1 recommended range. The warmest rack intake is 22.49 °C at rack F5B1-17, measured at the top of the rack, leaving 4.51 K of margin against the 27 °C recommended limit.</w:t>
       </w:r>
     </w:p>
     <w:p>
@@ -7582,7 +7622,7 @@
           <w:color w:val="0B0B0B"/>
           <w:sz w:val="20"/>
         </w:rPr>
-        <w:t>The cooling plant is thermally uniform in this configuration: the return air temperature spans 0.11 K across the 14 units, from 33.30 °C to 33.41 °C.</w:t>
+        <w:t>The cooling plant is thermally uniform in this configuration: the return air temperature spans 0.10 K across the 14 units, from 33.30 °C to 33.40 °C.</w:t>
       </w:r>
     </w:p>
     <w:p>
@@ -7612,7 +7652,7 @@
           <w:color w:val="0B0B0B"/>
           <w:sz w:val="20"/>
         </w:rPr>
-        <w:t>The room costs the most loaded unit 56.1 Pa of the 131 Pa its datasheet offers (43 %), and the least loaded 52.8 Pa.</w:t>
+        <w:t>The room costs the most loaded unit 56.2 Pa of the 131 Pa the unit can produce at the airflow it is moving (43 %), and the least loaded 52.8 Pa. That is the resistance of the room, not of the coil and filters inside the machine, which the unit's external static pressure already accounts for.</w:t>
       </w:r>
     </w:p>
     <w:p>

</xml_diff>

<commit_message>
The double-gallery run, at 3,000 iterations
The solve finished the full cap: 2,150 s of solver time on 4 cores, all
eleven checks passing, 440 racks between 22.0 and 22.45 degC at the top, the
warmest F6B2-03 at 22.45 with 4.55 K of margin, 5,099 kW removed across 14
units at 362.7 to 366.0 kW each, and 52.8 to 56.3 Pa of rise against the
131 Pa the unit's curve offers at this airflow.

Worth recording plainly: the field was settled by iteration 600, so the
useful run is about seven minutes and the remaining 2,400 iterations only
confirmed it. residualControl never fired because p_rgh levels off near
8e-4 -- normal for a room this size, and exactly why the checks rather than
the residuals decide when a run is done.

The experiment note and the README cost figure now carry the final numbers,
and the exported result and Word report are regenerated from them.

Co-Authored-By: Claude Opus 5 <noreply@anthropic.com>
Claude-Session: https://claude.ai/code/session_01S21ewTFM1RcXhxwR5hRE5Z
</commit_message>
<xml_diff>
--- a/results/hall-double-gallery/hall-double-gallery.docx
+++ b/results/hall-double-gallery/hall-double-gallery.docx
@@ -61,7 +61,7 @@
           <w:color w:val="0B0B0B"/>
           <w:sz w:val="52"/>
         </w:rPr>
-        <w:t>CFD Analysis of the hall-double-gallery Data Hall</w:t>
+        <w:t>CFD Analysis of the VIN03-type Data Hall</w:t>
       </w:r>
     </w:p>
     <w:p>
@@ -117,7 +117,7 @@
           <w:color w:val="898781"/>
           <w:sz w:val="16"/>
         </w:rPr>
-        <w:t>Case hall-double-gallery · solved to iteration 1800 · 275,400 cells · all checks passed</w:t>
+        <w:t>Case hall-double-gallery · solved to iteration 3000 · 275,400 cells · all checks passed</w:t>
       </w:r>
     </w:p>
     <w:p>
@@ -1100,7 +1100,7 @@
                 <w:color w:val="0B0B0B"/>
                 <w:sz w:val="17"/>
               </w:rPr>
-              <w:t>22.49 °C</w:t>
+              <w:t>22.45 °C</w:t>
             </w:r>
           </w:p>
         </w:tc>
@@ -1119,7 +1119,7 @@
                 <w:color w:val="0B0B0B"/>
                 <w:sz w:val="17"/>
               </w:rPr>
-              <w:t>rack F5B1-17, against the 27 °C ASHRAE recommended limit</w:t>
+              <w:t>rack F6B2-03, against the 27 °C ASHRAE recommended limit</w:t>
             </w:r>
           </w:p>
         </w:tc>
@@ -1277,7 +1277,7 @@
                 <w:color w:val="0B0B0B"/>
                 <w:sz w:val="17"/>
               </w:rPr>
-              <w:t>56.2 Pa</w:t>
+              <w:t>56.3 Pa</w:t>
             </w:r>
           </w:p>
         </w:tc>
@@ -2769,7 +2769,7 @@
                 <w:color w:val="0CA30C"/>
                 <w:sz w:val="17"/>
               </w:rPr>
-              <w:t>PASS — fan supplies 443.12804 kg/s and draws 443.12801 kg/s (0.000% apart)</w:t>
+              <w:t>PASS — fan supplies 443.12802 kg/s and draws 443.12803 kg/s (0.000% apart)</w:t>
             </w:r>
           </w:p>
         </w:tc>
@@ -2946,7 +2946,7 @@
                 <w:color w:val="0CA30C"/>
                 <w:sz w:val="17"/>
               </w:rPr>
-              <w:t>PASS — the return air carries 5099.52 kW of the 5099.60 kW installed (100%)</w:t>
+              <w:t>PASS — the return air carries 5099.20 kW of the 5099.60 kW installed (100%)</w:t>
             </w:r>
           </w:p>
         </w:tc>
@@ -3182,7 +3182,7 @@
                 <w:color w:val="0CA30C"/>
                 <w:sz w:val="17"/>
               </w:rPr>
-              <w:t>PASS — the most loaded unit (fan5) costs 56.2 Pa, the least 52.8 Pa, and the unit's P-Q curve offers 131 Pa at 104,181 m3/h per unit (43%); uncontrolled at full speed it would run at 128,817 m3/h and 85.9 Pa</w:t>
+              <w:t>PASS — the most loaded unit (fan5) costs 56.3 Pa, the least 52.8 Pa, and the unit's P-Q curve offers 131 Pa at 104,181 m3/h per unit (43%); uncontrolled at full speed it would run at 128,785 m3/h and 86.0 Pa</w:t>
             </w:r>
           </w:p>
         </w:tc>
@@ -3300,7 +3300,7 @@
                 <w:color w:val="0CA30C"/>
                 <w:sz w:val="17"/>
               </w:rPr>
-              <w:t>PASS — warmest rack inlet 22.5 degC at the top of F5B1-17 -- within ASHRAE recommended (18.0-27.0 degC)</w:t>
+              <w:t>PASS — warmest rack inlet 22.4 degC at the top of F6B2-03 -- within ASHRAE recommended (18.0-27.0 degC)</w:t>
             </w:r>
           </w:p>
         </w:tc>
@@ -3359,7 +3359,7 @@
                 <w:color w:val="0CA30C"/>
                 <w:sz w:val="17"/>
               </w:rPr>
-              <w:t>PASS — peak 5.49 m/s against a plausible 11.99 m/s (peak air 38.4 degC)</w:t>
+              <w:t>PASS — peak 5.50 m/s against a plausible 11.99 m/s (peak air 38.3 degC)</w:t>
             </w:r>
           </w:p>
         </w:tc>
@@ -3411,7 +3411,7 @@
       <w:r>
         <w:drawing>
           <wp:inline xmlns:a="http://schemas.openxmlformats.org/drawingml/2006/main" xmlns:pic="http://schemas.openxmlformats.org/drawingml/2006/picture">
-            <wp:extent cx="5760000" cy="2058294"/>
+            <wp:extent cx="5760000" cy="2064067"/>
             <wp:docPr id="1" name="Picture 1"/>
             <wp:cNvGraphicFramePr>
               <a:graphicFrameLocks noChangeAspect="1"/>
@@ -3432,7 +3432,7 @@
                   <pic:spPr>
                     <a:xfrm>
                       <a:off x="0" y="0"/>
-                      <a:ext cx="5760000" cy="2058294"/>
+                      <a:ext cx="5760000" cy="2064067"/>
                     </a:xfrm>
                     <a:prstGeom prst="rect"/>
                   </pic:spPr>
@@ -4053,7 +4053,7 @@
                 <w:color w:val="0B0B0B"/>
                 <w:sz w:val="17"/>
               </w:rPr>
-              <w:t>F5B1-17</w:t>
+              <w:t>F6B2-03</w:t>
             </w:r>
           </w:p>
         </w:tc>
@@ -4072,7 +4072,7 @@
                 <w:color w:val="0B0B0B"/>
                 <w:sz w:val="17"/>
               </w:rPr>
-              <w:t>F5B1</w:t>
+              <w:t>F6B2</w:t>
             </w:r>
           </w:p>
         </w:tc>
@@ -4091,7 +4091,7 @@
                 <w:color w:val="0B0B0B"/>
                 <w:sz w:val="17"/>
               </w:rPr>
-              <w:t>22.49 °C</w:t>
+              <w:t>22.45 °C</w:t>
             </w:r>
           </w:p>
         </w:tc>
@@ -4110,7 +4110,7 @@
                 <w:color w:val="0B0B0B"/>
                 <w:sz w:val="17"/>
               </w:rPr>
-              <w:t>23.26 °C</w:t>
+              <w:t>23.08 °C</w:t>
             </w:r>
           </w:p>
         </w:tc>
@@ -4129,7 +4129,7 @@
                 <w:color w:val="0B0B0B"/>
                 <w:sz w:val="17"/>
               </w:rPr>
-              <w:t>33.75 °C</w:t>
+              <w:t>33.71 °C</w:t>
             </w:r>
           </w:p>
         </w:tc>
@@ -4148,7 +4148,7 @@
                 <w:color w:val="0B0B0B"/>
                 <w:sz w:val="17"/>
               </w:rPr>
-              <w:t>10.49 K</w:t>
+              <w:t>10.63 K</w:t>
             </w:r>
           </w:p>
         </w:tc>
@@ -4188,7 +4188,547 @@
                 <w:color w:val="0B0B0B"/>
                 <w:sz w:val="17"/>
               </w:rPr>
-              <w:t>F6B2-04</w:t>
+              <w:t>F5B2-05</w:t>
+            </w:r>
+          </w:p>
+        </w:tc>
+        <w:tc>
+          <w:tcPr>
+            <w:tcW w:type="dxa" w:w="1360"/>
+          </w:tcPr>
+          <w:p>
+            <w:pPr>
+              <w:spacing w:after="40"/>
+            </w:pPr>
+            <w:r>
+              <w:rPr>
+                <w:b w:val="0"/>
+                <w:i w:val="0"/>
+                <w:color w:val="0B0B0B"/>
+                <w:sz w:val="17"/>
+              </w:rPr>
+              <w:t>F5B2</w:t>
+            </w:r>
+          </w:p>
+        </w:tc>
+        <w:tc>
+          <w:tcPr>
+            <w:tcW w:type="dxa" w:w="1360"/>
+          </w:tcPr>
+          <w:p>
+            <w:pPr>
+              <w:spacing w:after="40"/>
+            </w:pPr>
+            <w:r>
+              <w:rPr>
+                <w:b w:val="0"/>
+                <w:i w:val="0"/>
+                <w:color w:val="0B0B0B"/>
+                <w:sz w:val="17"/>
+              </w:rPr>
+              <w:t>22.43 °C</w:t>
+            </w:r>
+          </w:p>
+        </w:tc>
+        <w:tc>
+          <w:tcPr>
+            <w:tcW w:type="dxa" w:w="1360"/>
+          </w:tcPr>
+          <w:p>
+            <w:pPr>
+              <w:spacing w:after="40"/>
+            </w:pPr>
+            <w:r>
+              <w:rPr>
+                <w:b w:val="0"/>
+                <w:i w:val="0"/>
+                <w:color w:val="0B0B0B"/>
+                <w:sz w:val="17"/>
+              </w:rPr>
+              <w:t>23.20 °C</w:t>
+            </w:r>
+          </w:p>
+        </w:tc>
+        <w:tc>
+          <w:tcPr>
+            <w:tcW w:type="dxa" w:w="1360"/>
+          </w:tcPr>
+          <w:p>
+            <w:pPr>
+              <w:spacing w:after="40"/>
+            </w:pPr>
+            <w:r>
+              <w:rPr>
+                <w:b w:val="0"/>
+                <w:i w:val="0"/>
+                <w:color w:val="0B0B0B"/>
+                <w:sz w:val="17"/>
+              </w:rPr>
+              <w:t>33.76 °C</w:t>
+            </w:r>
+          </w:p>
+        </w:tc>
+        <w:tc>
+          <w:tcPr>
+            <w:tcW w:type="dxa" w:w="1360"/>
+          </w:tcPr>
+          <w:p>
+            <w:pPr>
+              <w:spacing w:after="40"/>
+            </w:pPr>
+            <w:r>
+              <w:rPr>
+                <w:b w:val="0"/>
+                <w:i w:val="0"/>
+                <w:color w:val="0B0B0B"/>
+                <w:sz w:val="17"/>
+              </w:rPr>
+              <w:t>10.56 K</w:t>
+            </w:r>
+          </w:p>
+        </w:tc>
+        <w:tc>
+          <w:tcPr>
+            <w:tcW w:type="dxa" w:w="1360"/>
+          </w:tcPr>
+          <w:p>
+            <w:pPr>
+              <w:spacing w:after="40"/>
+            </w:pPr>
+            <w:r>
+              <w:rPr>
+                <w:b w:val="0"/>
+                <w:i w:val="0"/>
+                <w:color w:val="0B0B0B"/>
+                <w:sz w:val="17"/>
+              </w:rPr>
+              <w:t>within ASHRAE recommended (18.0-27.0 degC)</w:t>
+            </w:r>
+          </w:p>
+        </w:tc>
+      </w:tr>
+      <w:tr>
+        <w:tc>
+          <w:tcPr>
+            <w:tcW w:type="dxa" w:w="1360"/>
+          </w:tcPr>
+          <w:p>
+            <w:pPr>
+              <w:spacing w:after="40"/>
+            </w:pPr>
+            <w:r>
+              <w:rPr>
+                <w:b w:val="0"/>
+                <w:i w:val="0"/>
+                <w:color w:val="0B0B0B"/>
+                <w:sz w:val="17"/>
+              </w:rPr>
+              <w:t>F5B1-20</w:t>
+            </w:r>
+          </w:p>
+        </w:tc>
+        <w:tc>
+          <w:tcPr>
+            <w:tcW w:type="dxa" w:w="1360"/>
+          </w:tcPr>
+          <w:p>
+            <w:pPr>
+              <w:spacing w:after="40"/>
+            </w:pPr>
+            <w:r>
+              <w:rPr>
+                <w:b w:val="0"/>
+                <w:i w:val="0"/>
+                <w:color w:val="0B0B0B"/>
+                <w:sz w:val="17"/>
+              </w:rPr>
+              <w:t>F5B1</w:t>
+            </w:r>
+          </w:p>
+        </w:tc>
+        <w:tc>
+          <w:tcPr>
+            <w:tcW w:type="dxa" w:w="1360"/>
+          </w:tcPr>
+          <w:p>
+            <w:pPr>
+              <w:spacing w:after="40"/>
+            </w:pPr>
+            <w:r>
+              <w:rPr>
+                <w:b w:val="0"/>
+                <w:i w:val="0"/>
+                <w:color w:val="0B0B0B"/>
+                <w:sz w:val="17"/>
+              </w:rPr>
+              <w:t>22.42 °C</w:t>
+            </w:r>
+          </w:p>
+        </w:tc>
+        <w:tc>
+          <w:tcPr>
+            <w:tcW w:type="dxa" w:w="1360"/>
+          </w:tcPr>
+          <w:p>
+            <w:pPr>
+              <w:spacing w:after="40"/>
+            </w:pPr>
+            <w:r>
+              <w:rPr>
+                <w:b w:val="0"/>
+                <w:i w:val="0"/>
+                <w:color w:val="0B0B0B"/>
+                <w:sz w:val="17"/>
+              </w:rPr>
+              <w:t>22.91 °C</w:t>
+            </w:r>
+          </w:p>
+        </w:tc>
+        <w:tc>
+          <w:tcPr>
+            <w:tcW w:type="dxa" w:w="1360"/>
+          </w:tcPr>
+          <w:p>
+            <w:pPr>
+              <w:spacing w:after="40"/>
+            </w:pPr>
+            <w:r>
+              <w:rPr>
+                <w:b w:val="0"/>
+                <w:i w:val="0"/>
+                <w:color w:val="0B0B0B"/>
+                <w:sz w:val="17"/>
+              </w:rPr>
+              <w:t>33.67 °C</w:t>
+            </w:r>
+          </w:p>
+        </w:tc>
+        <w:tc>
+          <w:tcPr>
+            <w:tcW w:type="dxa" w:w="1360"/>
+          </w:tcPr>
+          <w:p>
+            <w:pPr>
+              <w:spacing w:after="40"/>
+            </w:pPr>
+            <w:r>
+              <w:rPr>
+                <w:b w:val="0"/>
+                <w:i w:val="0"/>
+                <w:color w:val="0B0B0B"/>
+                <w:sz w:val="17"/>
+              </w:rPr>
+              <w:t>10.76 K</w:t>
+            </w:r>
+          </w:p>
+        </w:tc>
+        <w:tc>
+          <w:tcPr>
+            <w:tcW w:type="dxa" w:w="1360"/>
+          </w:tcPr>
+          <w:p>
+            <w:pPr>
+              <w:spacing w:after="40"/>
+            </w:pPr>
+            <w:r>
+              <w:rPr>
+                <w:b w:val="0"/>
+                <w:i w:val="0"/>
+                <w:color w:val="0B0B0B"/>
+                <w:sz w:val="17"/>
+              </w:rPr>
+              <w:t>within ASHRAE recommended (18.0-27.0 degC)</w:t>
+            </w:r>
+          </w:p>
+        </w:tc>
+      </w:tr>
+      <w:tr>
+        <w:tc>
+          <w:tcPr>
+            <w:tcW w:type="dxa" w:w="1360"/>
+          </w:tcPr>
+          <w:p>
+            <w:pPr>
+              <w:spacing w:after="40"/>
+            </w:pPr>
+            <w:r>
+              <w:rPr>
+                <w:b w:val="0"/>
+                <w:i w:val="0"/>
+                <w:color w:val="0B0B0B"/>
+                <w:sz w:val="17"/>
+              </w:rPr>
+              <w:t>F3B2-03</w:t>
+            </w:r>
+          </w:p>
+        </w:tc>
+        <w:tc>
+          <w:tcPr>
+            <w:tcW w:type="dxa" w:w="1360"/>
+          </w:tcPr>
+          <w:p>
+            <w:pPr>
+              <w:spacing w:after="40"/>
+            </w:pPr>
+            <w:r>
+              <w:rPr>
+                <w:b w:val="0"/>
+                <w:i w:val="0"/>
+                <w:color w:val="0B0B0B"/>
+                <w:sz w:val="17"/>
+              </w:rPr>
+              <w:t>F3B2</w:t>
+            </w:r>
+          </w:p>
+        </w:tc>
+        <w:tc>
+          <w:tcPr>
+            <w:tcW w:type="dxa" w:w="1360"/>
+          </w:tcPr>
+          <w:p>
+            <w:pPr>
+              <w:spacing w:after="40"/>
+            </w:pPr>
+            <w:r>
+              <w:rPr>
+                <w:b w:val="0"/>
+                <w:i w:val="0"/>
+                <w:color w:val="0B0B0B"/>
+                <w:sz w:val="17"/>
+              </w:rPr>
+              <w:t>22.40 °C</w:t>
+            </w:r>
+          </w:p>
+        </w:tc>
+        <w:tc>
+          <w:tcPr>
+            <w:tcW w:type="dxa" w:w="1360"/>
+          </w:tcPr>
+          <w:p>
+            <w:pPr>
+              <w:spacing w:after="40"/>
+            </w:pPr>
+            <w:r>
+              <w:rPr>
+                <w:b w:val="0"/>
+                <w:i w:val="0"/>
+                <w:color w:val="0B0B0B"/>
+                <w:sz w:val="17"/>
+              </w:rPr>
+              <w:t>23.06 °C</w:t>
+            </w:r>
+          </w:p>
+        </w:tc>
+        <w:tc>
+          <w:tcPr>
+            <w:tcW w:type="dxa" w:w="1360"/>
+          </w:tcPr>
+          <w:p>
+            <w:pPr>
+              <w:spacing w:after="40"/>
+            </w:pPr>
+            <w:r>
+              <w:rPr>
+                <w:b w:val="0"/>
+                <w:i w:val="0"/>
+                <w:color w:val="0B0B0B"/>
+                <w:sz w:val="17"/>
+              </w:rPr>
+              <w:t>33.68 °C</w:t>
+            </w:r>
+          </w:p>
+        </w:tc>
+        <w:tc>
+          <w:tcPr>
+            <w:tcW w:type="dxa" w:w="1360"/>
+          </w:tcPr>
+          <w:p>
+            <w:pPr>
+              <w:spacing w:after="40"/>
+            </w:pPr>
+            <w:r>
+              <w:rPr>
+                <w:b w:val="0"/>
+                <w:i w:val="0"/>
+                <w:color w:val="0B0B0B"/>
+                <w:sz w:val="17"/>
+              </w:rPr>
+              <w:t>10.62 K</w:t>
+            </w:r>
+          </w:p>
+        </w:tc>
+        <w:tc>
+          <w:tcPr>
+            <w:tcW w:type="dxa" w:w="1360"/>
+          </w:tcPr>
+          <w:p>
+            <w:pPr>
+              <w:spacing w:after="40"/>
+            </w:pPr>
+            <w:r>
+              <w:rPr>
+                <w:b w:val="0"/>
+                <w:i w:val="0"/>
+                <w:color w:val="0B0B0B"/>
+                <w:sz w:val="17"/>
+              </w:rPr>
+              <w:t>within ASHRAE recommended (18.0-27.0 degC)</w:t>
+            </w:r>
+          </w:p>
+        </w:tc>
+      </w:tr>
+      <w:tr>
+        <w:tc>
+          <w:tcPr>
+            <w:tcW w:type="dxa" w:w="1360"/>
+          </w:tcPr>
+          <w:p>
+            <w:pPr>
+              <w:spacing w:after="40"/>
+            </w:pPr>
+            <w:r>
+              <w:rPr>
+                <w:b w:val="0"/>
+                <w:i w:val="0"/>
+                <w:color w:val="0B0B0B"/>
+                <w:sz w:val="17"/>
+              </w:rPr>
+              <w:t>F3B2-04</w:t>
+            </w:r>
+          </w:p>
+        </w:tc>
+        <w:tc>
+          <w:tcPr>
+            <w:tcW w:type="dxa" w:w="1360"/>
+          </w:tcPr>
+          <w:p>
+            <w:pPr>
+              <w:spacing w:after="40"/>
+            </w:pPr>
+            <w:r>
+              <w:rPr>
+                <w:b w:val="0"/>
+                <w:i w:val="0"/>
+                <w:color w:val="0B0B0B"/>
+                <w:sz w:val="17"/>
+              </w:rPr>
+              <w:t>F3B2</w:t>
+            </w:r>
+          </w:p>
+        </w:tc>
+        <w:tc>
+          <w:tcPr>
+            <w:tcW w:type="dxa" w:w="1360"/>
+          </w:tcPr>
+          <w:p>
+            <w:pPr>
+              <w:spacing w:after="40"/>
+            </w:pPr>
+            <w:r>
+              <w:rPr>
+                <w:b w:val="0"/>
+                <w:i w:val="0"/>
+                <w:color w:val="0B0B0B"/>
+                <w:sz w:val="17"/>
+              </w:rPr>
+              <w:t>22.40 °C</w:t>
+            </w:r>
+          </w:p>
+        </w:tc>
+        <w:tc>
+          <w:tcPr>
+            <w:tcW w:type="dxa" w:w="1360"/>
+          </w:tcPr>
+          <w:p>
+            <w:pPr>
+              <w:spacing w:after="40"/>
+            </w:pPr>
+            <w:r>
+              <w:rPr>
+                <w:b w:val="0"/>
+                <w:i w:val="0"/>
+                <w:color w:val="0B0B0B"/>
+                <w:sz w:val="17"/>
+              </w:rPr>
+              <w:t>23.13 °C</w:t>
+            </w:r>
+          </w:p>
+        </w:tc>
+        <w:tc>
+          <w:tcPr>
+            <w:tcW w:type="dxa" w:w="1360"/>
+          </w:tcPr>
+          <w:p>
+            <w:pPr>
+              <w:spacing w:after="40"/>
+            </w:pPr>
+            <w:r>
+              <w:rPr>
+                <w:b w:val="0"/>
+                <w:i w:val="0"/>
+                <w:color w:val="0B0B0B"/>
+                <w:sz w:val="17"/>
+              </w:rPr>
+              <w:t>33.70 °C</w:t>
+            </w:r>
+          </w:p>
+        </w:tc>
+        <w:tc>
+          <w:tcPr>
+            <w:tcW w:type="dxa" w:w="1360"/>
+          </w:tcPr>
+          <w:p>
+            <w:pPr>
+              <w:spacing w:after="40"/>
+            </w:pPr>
+            <w:r>
+              <w:rPr>
+                <w:b w:val="0"/>
+                <w:i w:val="0"/>
+                <w:color w:val="0B0B0B"/>
+                <w:sz w:val="17"/>
+              </w:rPr>
+              <w:t>10.57 K</w:t>
+            </w:r>
+          </w:p>
+        </w:tc>
+        <w:tc>
+          <w:tcPr>
+            <w:tcW w:type="dxa" w:w="1360"/>
+          </w:tcPr>
+          <w:p>
+            <w:pPr>
+              <w:spacing w:after="40"/>
+            </w:pPr>
+            <w:r>
+              <w:rPr>
+                <w:b w:val="0"/>
+                <w:i w:val="0"/>
+                <w:color w:val="0B0B0B"/>
+                <w:sz w:val="17"/>
+              </w:rPr>
+              <w:t>within ASHRAE recommended (18.0-27.0 degC)</w:t>
+            </w:r>
+          </w:p>
+        </w:tc>
+      </w:tr>
+      <w:tr>
+        <w:tc>
+          <w:tcPr>
+            <w:tcW w:type="dxa" w:w="1360"/>
+          </w:tcPr>
+          <w:p>
+            <w:pPr>
+              <w:spacing w:after="40"/>
+            </w:pPr>
+            <w:r>
+              <w:rPr>
+                <w:b w:val="0"/>
+                <w:i w:val="0"/>
+                <w:color w:val="0B0B0B"/>
+                <w:sz w:val="17"/>
+              </w:rPr>
+              <w:t>F6B2-02</w:t>
             </w:r>
           </w:p>
         </w:tc>
@@ -4226,7 +4766,7 @@
                 <w:color w:val="0B0B0B"/>
                 <w:sz w:val="17"/>
               </w:rPr>
-              <w:t>22.49 °C</w:t>
+              <w:t>22.40 °C</w:t>
             </w:r>
           </w:p>
         </w:tc>
@@ -4245,7 +4785,7 @@
                 <w:color w:val="0B0B0B"/>
                 <w:sz w:val="17"/>
               </w:rPr>
-              <w:t>23.21 °C</w:t>
+              <w:t>22.85 °C</w:t>
             </w:r>
           </w:p>
         </w:tc>
@@ -4264,7 +4804,7 @@
                 <w:color w:val="0B0B0B"/>
                 <w:sz w:val="17"/>
               </w:rPr>
-              <w:t>33.74 °C</w:t>
+              <w:t>33.67 °C</w:t>
             </w:r>
           </w:p>
         </w:tc>
@@ -4283,7 +4823,142 @@
                 <w:color w:val="0B0B0B"/>
                 <w:sz w:val="17"/>
               </w:rPr>
-              <w:t>10.53 K</w:t>
+              <w:t>10.82 K</w:t>
+            </w:r>
+          </w:p>
+        </w:tc>
+        <w:tc>
+          <w:tcPr>
+            <w:tcW w:type="dxa" w:w="1360"/>
+          </w:tcPr>
+          <w:p>
+            <w:pPr>
+              <w:spacing w:after="40"/>
+            </w:pPr>
+            <w:r>
+              <w:rPr>
+                <w:b w:val="0"/>
+                <w:i w:val="0"/>
+                <w:color w:val="0B0B0B"/>
+                <w:sz w:val="17"/>
+              </w:rPr>
+              <w:t>within ASHRAE recommended (18.0-27.0 degC)</w:t>
+            </w:r>
+          </w:p>
+        </w:tc>
+      </w:tr>
+      <w:tr>
+        <w:tc>
+          <w:tcPr>
+            <w:tcW w:type="dxa" w:w="1360"/>
+          </w:tcPr>
+          <w:p>
+            <w:pPr>
+              <w:spacing w:after="40"/>
+            </w:pPr>
+            <w:r>
+              <w:rPr>
+                <w:b w:val="0"/>
+                <w:i w:val="0"/>
+                <w:color w:val="0B0B0B"/>
+                <w:sz w:val="17"/>
+              </w:rPr>
+              <w:t>F5B1-19</w:t>
+            </w:r>
+          </w:p>
+        </w:tc>
+        <w:tc>
+          <w:tcPr>
+            <w:tcW w:type="dxa" w:w="1360"/>
+          </w:tcPr>
+          <w:p>
+            <w:pPr>
+              <w:spacing w:after="40"/>
+            </w:pPr>
+            <w:r>
+              <w:rPr>
+                <w:b w:val="0"/>
+                <w:i w:val="0"/>
+                <w:color w:val="0B0B0B"/>
+                <w:sz w:val="17"/>
+              </w:rPr>
+              <w:t>F5B1</w:t>
+            </w:r>
+          </w:p>
+        </w:tc>
+        <w:tc>
+          <w:tcPr>
+            <w:tcW w:type="dxa" w:w="1360"/>
+          </w:tcPr>
+          <w:p>
+            <w:pPr>
+              <w:spacing w:after="40"/>
+            </w:pPr>
+            <w:r>
+              <w:rPr>
+                <w:b w:val="0"/>
+                <w:i w:val="0"/>
+                <w:color w:val="0B0B0B"/>
+                <w:sz w:val="17"/>
+              </w:rPr>
+              <w:t>22.39 °C</w:t>
+            </w:r>
+          </w:p>
+        </w:tc>
+        <w:tc>
+          <w:tcPr>
+            <w:tcW w:type="dxa" w:w="1360"/>
+          </w:tcPr>
+          <w:p>
+            <w:pPr>
+              <w:spacing w:after="40"/>
+            </w:pPr>
+            <w:r>
+              <w:rPr>
+                <w:b w:val="0"/>
+                <w:i w:val="0"/>
+                <w:color w:val="0B0B0B"/>
+                <w:sz w:val="17"/>
+              </w:rPr>
+              <w:t>23.08 °C</w:t>
+            </w:r>
+          </w:p>
+        </w:tc>
+        <w:tc>
+          <w:tcPr>
+            <w:tcW w:type="dxa" w:w="1360"/>
+          </w:tcPr>
+          <w:p>
+            <w:pPr>
+              <w:spacing w:after="40"/>
+            </w:pPr>
+            <w:r>
+              <w:rPr>
+                <w:b w:val="0"/>
+                <w:i w:val="0"/>
+                <w:color w:val="0B0B0B"/>
+                <w:sz w:val="17"/>
+              </w:rPr>
+              <w:t>33.72 °C</w:t>
+            </w:r>
+          </w:p>
+        </w:tc>
+        <w:tc>
+          <w:tcPr>
+            <w:tcW w:type="dxa" w:w="1360"/>
+          </w:tcPr>
+          <w:p>
+            <w:pPr>
+              <w:spacing w:after="40"/>
+            </w:pPr>
+            <w:r>
+              <w:rPr>
+                <w:b w:val="0"/>
+                <w:i w:val="0"/>
+                <w:color w:val="0B0B0B"/>
+                <w:sz w:val="17"/>
+              </w:rPr>
+              <w:t>10.64 K</w:t>
             </w:r>
           </w:p>
         </w:tc>
@@ -4361,1087 +5036,7 @@
                 <w:color w:val="0B0B0B"/>
                 <w:sz w:val="17"/>
               </w:rPr>
-              <w:t>22.47 °C</w:t>
-            </w:r>
-          </w:p>
-        </w:tc>
-        <w:tc>
-          <w:tcPr>
-            <w:tcW w:type="dxa" w:w="1360"/>
-          </w:tcPr>
-          <w:p>
-            <w:pPr>
-              <w:spacing w:after="40"/>
-            </w:pPr>
-            <w:r>
-              <w:rPr>
-                <w:b w:val="0"/>
-                <w:i w:val="0"/>
-                <w:color w:val="0B0B0B"/>
-                <w:sz w:val="17"/>
-              </w:rPr>
-              <w:t>23.19 °C</w:t>
-            </w:r>
-          </w:p>
-        </w:tc>
-        <w:tc>
-          <w:tcPr>
-            <w:tcW w:type="dxa" w:w="1360"/>
-          </w:tcPr>
-          <w:p>
-            <w:pPr>
-              <w:spacing w:after="40"/>
-            </w:pPr>
-            <w:r>
-              <w:rPr>
-                <w:b w:val="0"/>
-                <w:i w:val="0"/>
-                <w:color w:val="0B0B0B"/>
-                <w:sz w:val="17"/>
-              </w:rPr>
-              <w:t>33.73 °C</w:t>
-            </w:r>
-          </w:p>
-        </w:tc>
-        <w:tc>
-          <w:tcPr>
-            <w:tcW w:type="dxa" w:w="1360"/>
-          </w:tcPr>
-          <w:p>
-            <w:pPr>
-              <w:spacing w:after="40"/>
-            </w:pPr>
-            <w:r>
-              <w:rPr>
-                <w:b w:val="0"/>
-                <w:i w:val="0"/>
-                <w:color w:val="0B0B0B"/>
-                <w:sz w:val="17"/>
-              </w:rPr>
-              <w:t>10.54 K</w:t>
-            </w:r>
-          </w:p>
-        </w:tc>
-        <w:tc>
-          <w:tcPr>
-            <w:tcW w:type="dxa" w:w="1360"/>
-          </w:tcPr>
-          <w:p>
-            <w:pPr>
-              <w:spacing w:after="40"/>
-            </w:pPr>
-            <w:r>
-              <w:rPr>
-                <w:b w:val="0"/>
-                <w:i w:val="0"/>
-                <w:color w:val="0B0B0B"/>
-                <w:sz w:val="17"/>
-              </w:rPr>
-              <w:t>within ASHRAE recommended (18.0-27.0 degC)</w:t>
-            </w:r>
-          </w:p>
-        </w:tc>
-      </w:tr>
-      <w:tr>
-        <w:tc>
-          <w:tcPr>
-            <w:tcW w:type="dxa" w:w="1360"/>
-          </w:tcPr>
-          <w:p>
-            <w:pPr>
-              <w:spacing w:after="40"/>
-            </w:pPr>
-            <w:r>
-              <w:rPr>
-                <w:b w:val="0"/>
-                <w:i w:val="0"/>
-                <w:color w:val="0B0B0B"/>
-                <w:sz w:val="17"/>
-              </w:rPr>
-              <w:t>F5B1-16</w:t>
-            </w:r>
-          </w:p>
-        </w:tc>
-        <w:tc>
-          <w:tcPr>
-            <w:tcW w:type="dxa" w:w="1360"/>
-          </w:tcPr>
-          <w:p>
-            <w:pPr>
-              <w:spacing w:after="40"/>
-            </w:pPr>
-            <w:r>
-              <w:rPr>
-                <w:b w:val="0"/>
-                <w:i w:val="0"/>
-                <w:color w:val="0B0B0B"/>
-                <w:sz w:val="17"/>
-              </w:rPr>
-              <w:t>F5B1</w:t>
-            </w:r>
-          </w:p>
-        </w:tc>
-        <w:tc>
-          <w:tcPr>
-            <w:tcW w:type="dxa" w:w="1360"/>
-          </w:tcPr>
-          <w:p>
-            <w:pPr>
-              <w:spacing w:after="40"/>
-            </w:pPr>
-            <w:r>
-              <w:rPr>
-                <w:b w:val="0"/>
-                <w:i w:val="0"/>
-                <w:color w:val="0B0B0B"/>
-                <w:sz w:val="17"/>
-              </w:rPr>
-              <w:t>22.45 °C</w:t>
-            </w:r>
-          </w:p>
-        </w:tc>
-        <w:tc>
-          <w:tcPr>
-            <w:tcW w:type="dxa" w:w="1360"/>
-          </w:tcPr>
-          <w:p>
-            <w:pPr>
-              <w:spacing w:after="40"/>
-            </w:pPr>
-            <w:r>
-              <w:rPr>
-                <w:b w:val="0"/>
-                <w:i w:val="0"/>
-                <w:color w:val="0B0B0B"/>
-                <w:sz w:val="17"/>
-              </w:rPr>
-              <w:t>23.22 °C</w:t>
-            </w:r>
-          </w:p>
-        </w:tc>
-        <w:tc>
-          <w:tcPr>
-            <w:tcW w:type="dxa" w:w="1360"/>
-          </w:tcPr>
-          <w:p>
-            <w:pPr>
-              <w:spacing w:after="40"/>
-            </w:pPr>
-            <w:r>
-              <w:rPr>
-                <w:b w:val="0"/>
-                <w:i w:val="0"/>
-                <w:color w:val="0B0B0B"/>
-                <w:sz w:val="17"/>
-              </w:rPr>
-              <w:t>33.73 °C</w:t>
-            </w:r>
-          </w:p>
-        </w:tc>
-        <w:tc>
-          <w:tcPr>
-            <w:tcW w:type="dxa" w:w="1360"/>
-          </w:tcPr>
-          <w:p>
-            <w:pPr>
-              <w:spacing w:after="40"/>
-            </w:pPr>
-            <w:r>
-              <w:rPr>
-                <w:b w:val="0"/>
-                <w:i w:val="0"/>
-                <w:color w:val="0B0B0B"/>
-                <w:sz w:val="17"/>
-              </w:rPr>
-              <w:t>10.51 K</w:t>
-            </w:r>
-          </w:p>
-        </w:tc>
-        <w:tc>
-          <w:tcPr>
-            <w:tcW w:type="dxa" w:w="1360"/>
-          </w:tcPr>
-          <w:p>
-            <w:pPr>
-              <w:spacing w:after="40"/>
-            </w:pPr>
-            <w:r>
-              <w:rPr>
-                <w:b w:val="0"/>
-                <w:i w:val="0"/>
-                <w:color w:val="0B0B0B"/>
-                <w:sz w:val="17"/>
-              </w:rPr>
-              <w:t>within ASHRAE recommended (18.0-27.0 degC)</w:t>
-            </w:r>
-          </w:p>
-        </w:tc>
-      </w:tr>
-      <w:tr>
-        <w:tc>
-          <w:tcPr>
-            <w:tcW w:type="dxa" w:w="1360"/>
-          </w:tcPr>
-          <w:p>
-            <w:pPr>
-              <w:spacing w:after="40"/>
-            </w:pPr>
-            <w:r>
-              <w:rPr>
-                <w:b w:val="0"/>
-                <w:i w:val="0"/>
-                <w:color w:val="0B0B0B"/>
-                <w:sz w:val="17"/>
-              </w:rPr>
-              <w:t>F5B1-18</w:t>
-            </w:r>
-          </w:p>
-        </w:tc>
-        <w:tc>
-          <w:tcPr>
-            <w:tcW w:type="dxa" w:w="1360"/>
-          </w:tcPr>
-          <w:p>
-            <w:pPr>
-              <w:spacing w:after="40"/>
-            </w:pPr>
-            <w:r>
-              <w:rPr>
-                <w:b w:val="0"/>
-                <w:i w:val="0"/>
-                <w:color w:val="0B0B0B"/>
-                <w:sz w:val="17"/>
-              </w:rPr>
-              <w:t>F5B1</w:t>
-            </w:r>
-          </w:p>
-        </w:tc>
-        <w:tc>
-          <w:tcPr>
-            <w:tcW w:type="dxa" w:w="1360"/>
-          </w:tcPr>
-          <w:p>
-            <w:pPr>
-              <w:spacing w:after="40"/>
-            </w:pPr>
-            <w:r>
-              <w:rPr>
-                <w:b w:val="0"/>
-                <w:i w:val="0"/>
-                <w:color w:val="0B0B0B"/>
-                <w:sz w:val="17"/>
-              </w:rPr>
-              <w:t>22.45 °C</w:t>
-            </w:r>
-          </w:p>
-        </w:tc>
-        <w:tc>
-          <w:tcPr>
-            <w:tcW w:type="dxa" w:w="1360"/>
-          </w:tcPr>
-          <w:p>
-            <w:pPr>
-              <w:spacing w:after="40"/>
-            </w:pPr>
-            <w:r>
-              <w:rPr>
-                <w:b w:val="0"/>
-                <w:i w:val="0"/>
-                <w:color w:val="0B0B0B"/>
-                <w:sz w:val="17"/>
-              </w:rPr>
-              <w:t>23.22 °C</w:t>
-            </w:r>
-          </w:p>
-        </w:tc>
-        <w:tc>
-          <w:tcPr>
-            <w:tcW w:type="dxa" w:w="1360"/>
-          </w:tcPr>
-          <w:p>
-            <w:pPr>
-              <w:spacing w:after="40"/>
-            </w:pPr>
-            <w:r>
-              <w:rPr>
-                <w:b w:val="0"/>
-                <w:i w:val="0"/>
-                <w:color w:val="0B0B0B"/>
-                <w:sz w:val="17"/>
-              </w:rPr>
-              <w:t>33.74 °C</w:t>
-            </w:r>
-          </w:p>
-        </w:tc>
-        <w:tc>
-          <w:tcPr>
-            <w:tcW w:type="dxa" w:w="1360"/>
-          </w:tcPr>
-          <w:p>
-            <w:pPr>
-              <w:spacing w:after="40"/>
-            </w:pPr>
-            <w:r>
-              <w:rPr>
-                <w:b w:val="0"/>
-                <w:i w:val="0"/>
-                <w:color w:val="0B0B0B"/>
-                <w:sz w:val="17"/>
-              </w:rPr>
-              <w:t>10.52 K</w:t>
-            </w:r>
-          </w:p>
-        </w:tc>
-        <w:tc>
-          <w:tcPr>
-            <w:tcW w:type="dxa" w:w="1360"/>
-          </w:tcPr>
-          <w:p>
-            <w:pPr>
-              <w:spacing w:after="40"/>
-            </w:pPr>
-            <w:r>
-              <w:rPr>
-                <w:b w:val="0"/>
-                <w:i w:val="0"/>
-                <w:color w:val="0B0B0B"/>
-                <w:sz w:val="17"/>
-              </w:rPr>
-              <w:t>within ASHRAE recommended (18.0-27.0 degC)</w:t>
-            </w:r>
-          </w:p>
-        </w:tc>
-      </w:tr>
-      <w:tr>
-        <w:tc>
-          <w:tcPr>
-            <w:tcW w:type="dxa" w:w="1360"/>
-          </w:tcPr>
-          <w:p>
-            <w:pPr>
-              <w:spacing w:after="40"/>
-            </w:pPr>
-            <w:r>
-              <w:rPr>
-                <w:b w:val="0"/>
-                <w:i w:val="0"/>
-                <w:color w:val="0B0B0B"/>
-                <w:sz w:val="17"/>
-              </w:rPr>
-              <w:t>F6B1-20</w:t>
-            </w:r>
-          </w:p>
-        </w:tc>
-        <w:tc>
-          <w:tcPr>
-            <w:tcW w:type="dxa" w:w="1360"/>
-          </w:tcPr>
-          <w:p>
-            <w:pPr>
-              <w:spacing w:after="40"/>
-            </w:pPr>
-            <w:r>
-              <w:rPr>
-                <w:b w:val="0"/>
-                <w:i w:val="0"/>
-                <w:color w:val="0B0B0B"/>
-                <w:sz w:val="17"/>
-              </w:rPr>
-              <w:t>F6B1</w:t>
-            </w:r>
-          </w:p>
-        </w:tc>
-        <w:tc>
-          <w:tcPr>
-            <w:tcW w:type="dxa" w:w="1360"/>
-          </w:tcPr>
-          <w:p>
-            <w:pPr>
-              <w:spacing w:after="40"/>
-            </w:pPr>
-            <w:r>
-              <w:rPr>
-                <w:b w:val="0"/>
-                <w:i w:val="0"/>
-                <w:color w:val="0B0B0B"/>
-                <w:sz w:val="17"/>
-              </w:rPr>
-              <w:t>22.44 °C</w:t>
-            </w:r>
-          </w:p>
-        </w:tc>
-        <w:tc>
-          <w:tcPr>
-            <w:tcW w:type="dxa" w:w="1360"/>
-          </w:tcPr>
-          <w:p>
-            <w:pPr>
-              <w:spacing w:after="40"/>
-            </w:pPr>
-            <w:r>
-              <w:rPr>
-                <w:b w:val="0"/>
-                <w:i w:val="0"/>
-                <w:color w:val="0B0B0B"/>
-                <w:sz w:val="17"/>
-              </w:rPr>
-              <w:t>23.07 °C</w:t>
-            </w:r>
-          </w:p>
-        </w:tc>
-        <w:tc>
-          <w:tcPr>
-            <w:tcW w:type="dxa" w:w="1360"/>
-          </w:tcPr>
-          <w:p>
-            <w:pPr>
-              <w:spacing w:after="40"/>
-            </w:pPr>
-            <w:r>
-              <w:rPr>
-                <w:b w:val="0"/>
-                <w:i w:val="0"/>
-                <w:color w:val="0B0B0B"/>
-                <w:sz w:val="17"/>
-              </w:rPr>
-              <w:t>33.70 °C</w:t>
-            </w:r>
-          </w:p>
-        </w:tc>
-        <w:tc>
-          <w:tcPr>
-            <w:tcW w:type="dxa" w:w="1360"/>
-          </w:tcPr>
-          <w:p>
-            <w:pPr>
-              <w:spacing w:after="40"/>
-            </w:pPr>
-            <w:r>
-              <w:rPr>
-                <w:b w:val="0"/>
-                <w:i w:val="0"/>
-                <w:color w:val="0B0B0B"/>
-                <w:sz w:val="17"/>
-              </w:rPr>
-              <w:t>10.63 K</w:t>
-            </w:r>
-          </w:p>
-        </w:tc>
-        <w:tc>
-          <w:tcPr>
-            <w:tcW w:type="dxa" w:w="1360"/>
-          </w:tcPr>
-          <w:p>
-            <w:pPr>
-              <w:spacing w:after="40"/>
-            </w:pPr>
-            <w:r>
-              <w:rPr>
-                <w:b w:val="0"/>
-                <w:i w:val="0"/>
-                <w:color w:val="0B0B0B"/>
-                <w:sz w:val="17"/>
-              </w:rPr>
-              <w:t>within ASHRAE recommended (18.0-27.0 degC)</w:t>
-            </w:r>
-          </w:p>
-        </w:tc>
-      </w:tr>
-      <w:tr>
-        <w:tc>
-          <w:tcPr>
-            <w:tcW w:type="dxa" w:w="1360"/>
-          </w:tcPr>
-          <w:p>
-            <w:pPr>
-              <w:spacing w:after="40"/>
-            </w:pPr>
-            <w:r>
-              <w:rPr>
-                <w:b w:val="0"/>
-                <w:i w:val="0"/>
-                <w:color w:val="0B0B0B"/>
-                <w:sz w:val="17"/>
-              </w:rPr>
-              <w:t>F6B2-05</w:t>
-            </w:r>
-          </w:p>
-        </w:tc>
-        <w:tc>
-          <w:tcPr>
-            <w:tcW w:type="dxa" w:w="1360"/>
-          </w:tcPr>
-          <w:p>
-            <w:pPr>
-              <w:spacing w:after="40"/>
-            </w:pPr>
-            <w:r>
-              <w:rPr>
-                <w:b w:val="0"/>
-                <w:i w:val="0"/>
-                <w:color w:val="0B0B0B"/>
-                <w:sz w:val="17"/>
-              </w:rPr>
-              <w:t>F6B2</w:t>
-            </w:r>
-          </w:p>
-        </w:tc>
-        <w:tc>
-          <w:tcPr>
-            <w:tcW w:type="dxa" w:w="1360"/>
-          </w:tcPr>
-          <w:p>
-            <w:pPr>
-              <w:spacing w:after="40"/>
-            </w:pPr>
-            <w:r>
-              <w:rPr>
-                <w:b w:val="0"/>
-                <w:i w:val="0"/>
-                <w:color w:val="0B0B0B"/>
-                <w:sz w:val="17"/>
-              </w:rPr>
-              <w:t>22.44 °C</w:t>
-            </w:r>
-          </w:p>
-        </w:tc>
-        <w:tc>
-          <w:tcPr>
-            <w:tcW w:type="dxa" w:w="1360"/>
-          </w:tcPr>
-          <w:p>
-            <w:pPr>
-              <w:spacing w:after="40"/>
-            </w:pPr>
-            <w:r>
-              <w:rPr>
-                <w:b w:val="0"/>
-                <w:i w:val="0"/>
-                <w:color w:val="0B0B0B"/>
-                <w:sz w:val="17"/>
-              </w:rPr>
-              <w:t>23.21 °C</w:t>
-            </w:r>
-          </w:p>
-        </w:tc>
-        <w:tc>
-          <w:tcPr>
-            <w:tcW w:type="dxa" w:w="1360"/>
-          </w:tcPr>
-          <w:p>
-            <w:pPr>
-              <w:spacing w:after="40"/>
-            </w:pPr>
-            <w:r>
-              <w:rPr>
-                <w:b w:val="0"/>
-                <w:i w:val="0"/>
-                <w:color w:val="0B0B0B"/>
-                <w:sz w:val="17"/>
-              </w:rPr>
-              <w:t>33.76 °C</w:t>
-            </w:r>
-          </w:p>
-        </w:tc>
-        <w:tc>
-          <w:tcPr>
-            <w:tcW w:type="dxa" w:w="1360"/>
-          </w:tcPr>
-          <w:p>
-            <w:pPr>
-              <w:spacing w:after="40"/>
-            </w:pPr>
-            <w:r>
-              <w:rPr>
-                <w:b w:val="0"/>
-                <w:i w:val="0"/>
-                <w:color w:val="0B0B0B"/>
-                <w:sz w:val="17"/>
-              </w:rPr>
-              <w:t>10.55 K</w:t>
-            </w:r>
-          </w:p>
-        </w:tc>
-        <w:tc>
-          <w:tcPr>
-            <w:tcW w:type="dxa" w:w="1360"/>
-          </w:tcPr>
-          <w:p>
-            <w:pPr>
-              <w:spacing w:after="40"/>
-            </w:pPr>
-            <w:r>
-              <w:rPr>
-                <w:b w:val="0"/>
-                <w:i w:val="0"/>
-                <w:color w:val="0B0B0B"/>
-                <w:sz w:val="17"/>
-              </w:rPr>
-              <w:t>within ASHRAE recommended (18.0-27.0 degC)</w:t>
-            </w:r>
-          </w:p>
-        </w:tc>
-      </w:tr>
-      <w:tr>
-        <w:tc>
-          <w:tcPr>
-            <w:tcW w:type="dxa" w:w="1360"/>
-          </w:tcPr>
-          <w:p>
-            <w:pPr>
-              <w:spacing w:after="40"/>
-            </w:pPr>
-            <w:r>
-              <w:rPr>
-                <w:b w:val="0"/>
-                <w:i w:val="0"/>
-                <w:color w:val="0B0B0B"/>
-                <w:sz w:val="17"/>
-              </w:rPr>
-              <w:t>F5B2-03</w:t>
-            </w:r>
-          </w:p>
-        </w:tc>
-        <w:tc>
-          <w:tcPr>
-            <w:tcW w:type="dxa" w:w="1360"/>
-          </w:tcPr>
-          <w:p>
-            <w:pPr>
-              <w:spacing w:after="40"/>
-            </w:pPr>
-            <w:r>
-              <w:rPr>
-                <w:b w:val="0"/>
-                <w:i w:val="0"/>
-                <w:color w:val="0B0B0B"/>
-                <w:sz w:val="17"/>
-              </w:rPr>
-              <w:t>F5B2</w:t>
-            </w:r>
-          </w:p>
-        </w:tc>
-        <w:tc>
-          <w:tcPr>
-            <w:tcW w:type="dxa" w:w="1360"/>
-          </w:tcPr>
-          <w:p>
-            <w:pPr>
-              <w:spacing w:after="40"/>
-            </w:pPr>
-            <w:r>
-              <w:rPr>
-                <w:b w:val="0"/>
-                <w:i w:val="0"/>
-                <w:color w:val="0B0B0B"/>
-                <w:sz w:val="17"/>
-              </w:rPr>
-              <w:t>22.43 °C</w:t>
-            </w:r>
-          </w:p>
-        </w:tc>
-        <w:tc>
-          <w:tcPr>
-            <w:tcW w:type="dxa" w:w="1360"/>
-          </w:tcPr>
-          <w:p>
-            <w:pPr>
-              <w:spacing w:after="40"/>
-            </w:pPr>
-            <w:r>
-              <w:rPr>
-                <w:b w:val="0"/>
-                <w:i w:val="0"/>
-                <w:color w:val="0B0B0B"/>
-                <w:sz w:val="17"/>
-              </w:rPr>
-              <w:t>22.99 °C</w:t>
-            </w:r>
-          </w:p>
-        </w:tc>
-        <w:tc>
-          <w:tcPr>
-            <w:tcW w:type="dxa" w:w="1360"/>
-          </w:tcPr>
-          <w:p>
-            <w:pPr>
-              <w:spacing w:after="40"/>
-            </w:pPr>
-            <w:r>
-              <w:rPr>
-                <w:b w:val="0"/>
-                <w:i w:val="0"/>
-                <w:color w:val="0B0B0B"/>
-                <w:sz w:val="17"/>
-              </w:rPr>
-              <w:t>33.67 °C</w:t>
-            </w:r>
-          </w:p>
-        </w:tc>
-        <w:tc>
-          <w:tcPr>
-            <w:tcW w:type="dxa" w:w="1360"/>
-          </w:tcPr>
-          <w:p>
-            <w:pPr>
-              <w:spacing w:after="40"/>
-            </w:pPr>
-            <w:r>
-              <w:rPr>
-                <w:b w:val="0"/>
-                <w:i w:val="0"/>
-                <w:color w:val="0B0B0B"/>
-                <w:sz w:val="17"/>
-              </w:rPr>
-              <w:t>10.68 K</w:t>
-            </w:r>
-          </w:p>
-        </w:tc>
-        <w:tc>
-          <w:tcPr>
-            <w:tcW w:type="dxa" w:w="1360"/>
-          </w:tcPr>
-          <w:p>
-            <w:pPr>
-              <w:spacing w:after="40"/>
-            </w:pPr>
-            <w:r>
-              <w:rPr>
-                <w:b w:val="0"/>
-                <w:i w:val="0"/>
-                <w:color w:val="0B0B0B"/>
-                <w:sz w:val="17"/>
-              </w:rPr>
-              <w:t>within ASHRAE recommended (18.0-27.0 degC)</w:t>
-            </w:r>
-          </w:p>
-        </w:tc>
-      </w:tr>
-      <w:tr>
-        <w:tc>
-          <w:tcPr>
-            <w:tcW w:type="dxa" w:w="1360"/>
-          </w:tcPr>
-          <w:p>
-            <w:pPr>
-              <w:spacing w:after="40"/>
-            </w:pPr>
-            <w:r>
-              <w:rPr>
-                <w:b w:val="0"/>
-                <w:i w:val="0"/>
-                <w:color w:val="0B0B0B"/>
-                <w:sz w:val="17"/>
-              </w:rPr>
-              <w:t>F6B2-03</w:t>
-            </w:r>
-          </w:p>
-        </w:tc>
-        <w:tc>
-          <w:tcPr>
-            <w:tcW w:type="dxa" w:w="1360"/>
-          </w:tcPr>
-          <w:p>
-            <w:pPr>
-              <w:spacing w:after="40"/>
-            </w:pPr>
-            <w:r>
-              <w:rPr>
-                <w:b w:val="0"/>
-                <w:i w:val="0"/>
-                <w:color w:val="0B0B0B"/>
-                <w:sz w:val="17"/>
-              </w:rPr>
-              <w:t>F6B2</w:t>
-            </w:r>
-          </w:p>
-        </w:tc>
-        <w:tc>
-          <w:tcPr>
-            <w:tcW w:type="dxa" w:w="1360"/>
-          </w:tcPr>
-          <w:p>
-            <w:pPr>
-              <w:spacing w:after="40"/>
-            </w:pPr>
-            <w:r>
-              <w:rPr>
-                <w:b w:val="0"/>
-                <w:i w:val="0"/>
-                <w:color w:val="0B0B0B"/>
-                <w:sz w:val="17"/>
-              </w:rPr>
-              <w:t>22.42 °C</w:t>
-            </w:r>
-          </w:p>
-        </w:tc>
-        <w:tc>
-          <w:tcPr>
-            <w:tcW w:type="dxa" w:w="1360"/>
-          </w:tcPr>
-          <w:p>
-            <w:pPr>
-              <w:spacing w:after="40"/>
-            </w:pPr>
-            <w:r>
-              <w:rPr>
-                <w:b w:val="0"/>
-                <w:i w:val="0"/>
-                <w:color w:val="0B0B0B"/>
-                <w:sz w:val="17"/>
-              </w:rPr>
-              <w:t>23.08 °C</w:t>
-            </w:r>
-          </w:p>
-        </w:tc>
-        <w:tc>
-          <w:tcPr>
-            <w:tcW w:type="dxa" w:w="1360"/>
-          </w:tcPr>
-          <w:p>
-            <w:pPr>
-              <w:spacing w:after="40"/>
-            </w:pPr>
-            <w:r>
-              <w:rPr>
-                <w:b w:val="0"/>
-                <w:i w:val="0"/>
-                <w:color w:val="0B0B0B"/>
-                <w:sz w:val="17"/>
-              </w:rPr>
-              <w:t>33.69 °C</w:t>
-            </w:r>
-          </w:p>
-        </w:tc>
-        <w:tc>
-          <w:tcPr>
-            <w:tcW w:type="dxa" w:w="1360"/>
-          </w:tcPr>
-          <w:p>
-            <w:pPr>
-              <w:spacing w:after="40"/>
-            </w:pPr>
-            <w:r>
-              <w:rPr>
-                <w:b w:val="0"/>
-                <w:i w:val="0"/>
-                <w:color w:val="0B0B0B"/>
-                <w:sz w:val="17"/>
-              </w:rPr>
-              <w:t>10.61 K</w:t>
-            </w:r>
-          </w:p>
-        </w:tc>
-        <w:tc>
-          <w:tcPr>
-            <w:tcW w:type="dxa" w:w="1360"/>
-          </w:tcPr>
-          <w:p>
-            <w:pPr>
-              <w:spacing w:after="40"/>
-            </w:pPr>
-            <w:r>
-              <w:rPr>
-                <w:b w:val="0"/>
-                <w:i w:val="0"/>
-                <w:color w:val="0B0B0B"/>
-                <w:sz w:val="17"/>
-              </w:rPr>
-              <w:t>within ASHRAE recommended (18.0-27.0 degC)</w:t>
-            </w:r>
-          </w:p>
-        </w:tc>
-      </w:tr>
-      <w:tr>
-        <w:tc>
-          <w:tcPr>
-            <w:tcW w:type="dxa" w:w="1360"/>
-          </w:tcPr>
-          <w:p>
-            <w:pPr>
-              <w:spacing w:after="40"/>
-            </w:pPr>
-            <w:r>
-              <w:rPr>
-                <w:b w:val="0"/>
-                <w:i w:val="0"/>
-                <w:color w:val="0B0B0B"/>
-                <w:sz w:val="17"/>
-              </w:rPr>
-              <w:t>F5B2-05</w:t>
-            </w:r>
-          </w:p>
-        </w:tc>
-        <w:tc>
-          <w:tcPr>
-            <w:tcW w:type="dxa" w:w="1360"/>
-          </w:tcPr>
-          <w:p>
-            <w:pPr>
-              <w:spacing w:after="40"/>
-            </w:pPr>
-            <w:r>
-              <w:rPr>
-                <w:b w:val="0"/>
-                <w:i w:val="0"/>
-                <w:color w:val="0B0B0B"/>
-                <w:sz w:val="17"/>
-              </w:rPr>
-              <w:t>F5B2</w:t>
-            </w:r>
-          </w:p>
-        </w:tc>
-        <w:tc>
-          <w:tcPr>
-            <w:tcW w:type="dxa" w:w="1360"/>
-          </w:tcPr>
-          <w:p>
-            <w:pPr>
-              <w:spacing w:after="40"/>
-            </w:pPr>
-            <w:r>
-              <w:rPr>
-                <w:b w:val="0"/>
-                <w:i w:val="0"/>
-                <w:color w:val="0B0B0B"/>
-                <w:sz w:val="17"/>
-              </w:rPr>
-              <w:t>22.41 °C</w:t>
-            </w:r>
-          </w:p>
-        </w:tc>
-        <w:tc>
-          <w:tcPr>
-            <w:tcW w:type="dxa" w:w="1360"/>
-          </w:tcPr>
-          <w:p>
-            <w:pPr>
-              <w:spacing w:after="40"/>
-            </w:pPr>
-            <w:r>
-              <w:rPr>
-                <w:b w:val="0"/>
-                <w:i w:val="0"/>
-                <w:color w:val="0B0B0B"/>
-                <w:sz w:val="17"/>
-              </w:rPr>
-              <w:t>23.20 °C</w:t>
-            </w:r>
-          </w:p>
-        </w:tc>
-        <w:tc>
-          <w:tcPr>
-            <w:tcW w:type="dxa" w:w="1360"/>
-          </w:tcPr>
-          <w:p>
-            <w:pPr>
-              <w:spacing w:after="40"/>
-            </w:pPr>
-            <w:r>
-              <w:rPr>
-                <w:b w:val="0"/>
-                <w:i w:val="0"/>
-                <w:color w:val="0B0B0B"/>
-                <w:sz w:val="17"/>
-              </w:rPr>
-              <w:t>33.73 °C</w:t>
-            </w:r>
-          </w:p>
-        </w:tc>
-        <w:tc>
-          <w:tcPr>
-            <w:tcW w:type="dxa" w:w="1360"/>
-          </w:tcPr>
-          <w:p>
-            <w:pPr>
-              <w:spacing w:after="40"/>
-            </w:pPr>
-            <w:r>
-              <w:rPr>
-                <w:b w:val="0"/>
-                <w:i w:val="0"/>
-                <w:color w:val="0B0B0B"/>
-                <w:sz w:val="17"/>
-              </w:rPr>
-              <w:t>10.53 K</w:t>
-            </w:r>
-          </w:p>
-        </w:tc>
-        <w:tc>
-          <w:tcPr>
-            <w:tcW w:type="dxa" w:w="1360"/>
-          </w:tcPr>
-          <w:p>
-            <w:pPr>
-              <w:spacing w:after="40"/>
-            </w:pPr>
-            <w:r>
-              <w:rPr>
-                <w:b w:val="0"/>
-                <w:i w:val="0"/>
-                <w:color w:val="0B0B0B"/>
-                <w:sz w:val="17"/>
-              </w:rPr>
-              <w:t>within ASHRAE recommended (18.0-27.0 degC)</w:t>
-            </w:r>
-          </w:p>
-        </w:tc>
-      </w:tr>
-      <w:tr>
-        <w:tc>
-          <w:tcPr>
-            <w:tcW w:type="dxa" w:w="1360"/>
-          </w:tcPr>
-          <w:p>
-            <w:pPr>
-              <w:spacing w:after="40"/>
-            </w:pPr>
-            <w:r>
-              <w:rPr>
-                <w:b w:val="0"/>
-                <w:i w:val="0"/>
-                <w:color w:val="0B0B0B"/>
-                <w:sz w:val="17"/>
-              </w:rPr>
-              <w:t>F6B1-19</w:t>
-            </w:r>
-          </w:p>
-        </w:tc>
-        <w:tc>
-          <w:tcPr>
-            <w:tcW w:type="dxa" w:w="1360"/>
-          </w:tcPr>
-          <w:p>
-            <w:pPr>
-              <w:spacing w:after="40"/>
-            </w:pPr>
-            <w:r>
-              <w:rPr>
-                <w:b w:val="0"/>
-                <w:i w:val="0"/>
-                <w:color w:val="0B0B0B"/>
-                <w:sz w:val="17"/>
-              </w:rPr>
-              <w:t>F6B1</w:t>
-            </w:r>
-          </w:p>
-        </w:tc>
-        <w:tc>
-          <w:tcPr>
-            <w:tcW w:type="dxa" w:w="1360"/>
-          </w:tcPr>
-          <w:p>
-            <w:pPr>
-              <w:spacing w:after="40"/>
-            </w:pPr>
-            <w:r>
-              <w:rPr>
-                <w:b w:val="0"/>
-                <w:i w:val="0"/>
-                <w:color w:val="0B0B0B"/>
-                <w:sz w:val="17"/>
-              </w:rPr>
-              <w:t>22.38 °C</w:t>
+              <w:t>22.39 °C</w:t>
             </w:r>
           </w:p>
         </w:tc>
@@ -5538,7 +5133,7 @@
                 <w:color w:val="0B0B0B"/>
                 <w:sz w:val="17"/>
               </w:rPr>
-              <w:t>F6B1-21</w:t>
+              <w:t>F5B2-06</w:t>
             </w:r>
           </w:p>
         </w:tc>
@@ -5557,7 +5152,7 @@
                 <w:color w:val="0B0B0B"/>
                 <w:sz w:val="17"/>
               </w:rPr>
-              <w:t>F6B1</w:t>
+              <w:t>F5B2</w:t>
             </w:r>
           </w:p>
         </w:tc>
@@ -5595,7 +5190,7 @@
                 <w:color w:val="0B0B0B"/>
                 <w:sz w:val="17"/>
               </w:rPr>
-              <w:t>22.85 °C</w:t>
+              <w:t>23.19 °C</w:t>
             </w:r>
           </w:p>
         </w:tc>
@@ -5614,7 +5209,7 @@
                 <w:color w:val="0B0B0B"/>
                 <w:sz w:val="17"/>
               </w:rPr>
-              <w:t>33.63 °C</w:t>
+              <w:t>33.75 °C</w:t>
             </w:r>
           </w:p>
         </w:tc>
@@ -5633,7 +5228,412 @@
                 <w:color w:val="0B0B0B"/>
                 <w:sz w:val="17"/>
               </w:rPr>
-              <w:t>10.78 K</w:t>
+              <w:t>10.56 K</w:t>
+            </w:r>
+          </w:p>
+        </w:tc>
+        <w:tc>
+          <w:tcPr>
+            <w:tcW w:type="dxa" w:w="1360"/>
+          </w:tcPr>
+          <w:p>
+            <w:pPr>
+              <w:spacing w:after="40"/>
+            </w:pPr>
+            <w:r>
+              <w:rPr>
+                <w:b w:val="0"/>
+                <w:i w:val="0"/>
+                <w:color w:val="0B0B0B"/>
+                <w:sz w:val="17"/>
+              </w:rPr>
+              <w:t>within ASHRAE recommended (18.0-27.0 degC)</w:t>
+            </w:r>
+          </w:p>
+        </w:tc>
+      </w:tr>
+      <w:tr>
+        <w:tc>
+          <w:tcPr>
+            <w:tcW w:type="dxa" w:w="1360"/>
+          </w:tcPr>
+          <w:p>
+            <w:pPr>
+              <w:spacing w:after="40"/>
+            </w:pPr>
+            <w:r>
+              <w:rPr>
+                <w:b w:val="0"/>
+                <w:i w:val="0"/>
+                <w:color w:val="0B0B0B"/>
+                <w:sz w:val="17"/>
+              </w:rPr>
+              <w:t>F6B2-04</w:t>
+            </w:r>
+          </w:p>
+        </w:tc>
+        <w:tc>
+          <w:tcPr>
+            <w:tcW w:type="dxa" w:w="1360"/>
+          </w:tcPr>
+          <w:p>
+            <w:pPr>
+              <w:spacing w:after="40"/>
+            </w:pPr>
+            <w:r>
+              <w:rPr>
+                <w:b w:val="0"/>
+                <w:i w:val="0"/>
+                <w:color w:val="0B0B0B"/>
+                <w:sz w:val="17"/>
+              </w:rPr>
+              <w:t>F6B2</w:t>
+            </w:r>
+          </w:p>
+        </w:tc>
+        <w:tc>
+          <w:tcPr>
+            <w:tcW w:type="dxa" w:w="1360"/>
+          </w:tcPr>
+          <w:p>
+            <w:pPr>
+              <w:spacing w:after="40"/>
+            </w:pPr>
+            <w:r>
+              <w:rPr>
+                <w:b w:val="0"/>
+                <w:i w:val="0"/>
+                <w:color w:val="0B0B0B"/>
+                <w:sz w:val="17"/>
+              </w:rPr>
+              <w:t>22.37 °C</w:t>
+            </w:r>
+          </w:p>
+        </w:tc>
+        <w:tc>
+          <w:tcPr>
+            <w:tcW w:type="dxa" w:w="1360"/>
+          </w:tcPr>
+          <w:p>
+            <w:pPr>
+              <w:spacing w:after="40"/>
+            </w:pPr>
+            <w:r>
+              <w:rPr>
+                <w:b w:val="0"/>
+                <w:i w:val="0"/>
+                <w:color w:val="0B0B0B"/>
+                <w:sz w:val="17"/>
+              </w:rPr>
+              <w:t>23.13 °C</w:t>
+            </w:r>
+          </w:p>
+        </w:tc>
+        <w:tc>
+          <w:tcPr>
+            <w:tcW w:type="dxa" w:w="1360"/>
+          </w:tcPr>
+          <w:p>
+            <w:pPr>
+              <w:spacing w:after="40"/>
+            </w:pPr>
+            <w:r>
+              <w:rPr>
+                <w:b w:val="0"/>
+                <w:i w:val="0"/>
+                <w:color w:val="0B0B0B"/>
+                <w:sz w:val="17"/>
+              </w:rPr>
+              <w:t>33.71 °C</w:t>
+            </w:r>
+          </w:p>
+        </w:tc>
+        <w:tc>
+          <w:tcPr>
+            <w:tcW w:type="dxa" w:w="1360"/>
+          </w:tcPr>
+          <w:p>
+            <w:pPr>
+              <w:spacing w:after="40"/>
+            </w:pPr>
+            <w:r>
+              <w:rPr>
+                <w:b w:val="0"/>
+                <w:i w:val="0"/>
+                <w:color w:val="0B0B0B"/>
+                <w:sz w:val="17"/>
+              </w:rPr>
+              <w:t>10.58 K</w:t>
+            </w:r>
+          </w:p>
+        </w:tc>
+        <w:tc>
+          <w:tcPr>
+            <w:tcW w:type="dxa" w:w="1360"/>
+          </w:tcPr>
+          <w:p>
+            <w:pPr>
+              <w:spacing w:after="40"/>
+            </w:pPr>
+            <w:r>
+              <w:rPr>
+                <w:b w:val="0"/>
+                <w:i w:val="0"/>
+                <w:color w:val="0B0B0B"/>
+                <w:sz w:val="17"/>
+              </w:rPr>
+              <w:t>within ASHRAE recommended (18.0-27.0 degC)</w:t>
+            </w:r>
+          </w:p>
+        </w:tc>
+      </w:tr>
+      <w:tr>
+        <w:tc>
+          <w:tcPr>
+            <w:tcW w:type="dxa" w:w="1360"/>
+          </w:tcPr>
+          <w:p>
+            <w:pPr>
+              <w:spacing w:after="40"/>
+            </w:pPr>
+            <w:r>
+              <w:rPr>
+                <w:b w:val="0"/>
+                <w:i w:val="0"/>
+                <w:color w:val="0B0B0B"/>
+                <w:sz w:val="17"/>
+              </w:rPr>
+              <w:t>F8B1-20</w:t>
+            </w:r>
+          </w:p>
+        </w:tc>
+        <w:tc>
+          <w:tcPr>
+            <w:tcW w:type="dxa" w:w="1360"/>
+          </w:tcPr>
+          <w:p>
+            <w:pPr>
+              <w:spacing w:after="40"/>
+            </w:pPr>
+            <w:r>
+              <w:rPr>
+                <w:b w:val="0"/>
+                <w:i w:val="0"/>
+                <w:color w:val="0B0B0B"/>
+                <w:sz w:val="17"/>
+              </w:rPr>
+              <w:t>F8B1</w:t>
+            </w:r>
+          </w:p>
+        </w:tc>
+        <w:tc>
+          <w:tcPr>
+            <w:tcW w:type="dxa" w:w="1360"/>
+          </w:tcPr>
+          <w:p>
+            <w:pPr>
+              <w:spacing w:after="40"/>
+            </w:pPr>
+            <w:r>
+              <w:rPr>
+                <w:b w:val="0"/>
+                <w:i w:val="0"/>
+                <w:color w:val="0B0B0B"/>
+                <w:sz w:val="17"/>
+              </w:rPr>
+              <w:t>22.37 °C</w:t>
+            </w:r>
+          </w:p>
+        </w:tc>
+        <w:tc>
+          <w:tcPr>
+            <w:tcW w:type="dxa" w:w="1360"/>
+          </w:tcPr>
+          <w:p>
+            <w:pPr>
+              <w:spacing w:after="40"/>
+            </w:pPr>
+            <w:r>
+              <w:rPr>
+                <w:b w:val="0"/>
+                <w:i w:val="0"/>
+                <w:color w:val="0B0B0B"/>
+                <w:sz w:val="17"/>
+              </w:rPr>
+              <w:t>23.03 °C</w:t>
+            </w:r>
+          </w:p>
+        </w:tc>
+        <w:tc>
+          <w:tcPr>
+            <w:tcW w:type="dxa" w:w="1360"/>
+          </w:tcPr>
+          <w:p>
+            <w:pPr>
+              <w:spacing w:after="40"/>
+            </w:pPr>
+            <w:r>
+              <w:rPr>
+                <w:b w:val="0"/>
+                <w:i w:val="0"/>
+                <w:color w:val="0B0B0B"/>
+                <w:sz w:val="17"/>
+              </w:rPr>
+              <w:t>33.68 °C</w:t>
+            </w:r>
+          </w:p>
+        </w:tc>
+        <w:tc>
+          <w:tcPr>
+            <w:tcW w:type="dxa" w:w="1360"/>
+          </w:tcPr>
+          <w:p>
+            <w:pPr>
+              <w:spacing w:after="40"/>
+            </w:pPr>
+            <w:r>
+              <w:rPr>
+                <w:b w:val="0"/>
+                <w:i w:val="0"/>
+                <w:color w:val="0B0B0B"/>
+                <w:sz w:val="17"/>
+              </w:rPr>
+              <w:t>10.65 K</w:t>
+            </w:r>
+          </w:p>
+        </w:tc>
+        <w:tc>
+          <w:tcPr>
+            <w:tcW w:type="dxa" w:w="1360"/>
+          </w:tcPr>
+          <w:p>
+            <w:pPr>
+              <w:spacing w:after="40"/>
+            </w:pPr>
+            <w:r>
+              <w:rPr>
+                <w:b w:val="0"/>
+                <w:i w:val="0"/>
+                <w:color w:val="0B0B0B"/>
+                <w:sz w:val="17"/>
+              </w:rPr>
+              <w:t>within ASHRAE recommended (18.0-27.0 degC)</w:t>
+            </w:r>
+          </w:p>
+        </w:tc>
+      </w:tr>
+      <w:tr>
+        <w:tc>
+          <w:tcPr>
+            <w:tcW w:type="dxa" w:w="1360"/>
+          </w:tcPr>
+          <w:p>
+            <w:pPr>
+              <w:spacing w:after="40"/>
+            </w:pPr>
+            <w:r>
+              <w:rPr>
+                <w:b w:val="0"/>
+                <w:i w:val="0"/>
+                <w:color w:val="0B0B0B"/>
+                <w:sz w:val="17"/>
+              </w:rPr>
+              <w:t>F3B1-16</w:t>
+            </w:r>
+          </w:p>
+        </w:tc>
+        <w:tc>
+          <w:tcPr>
+            <w:tcW w:type="dxa" w:w="1360"/>
+          </w:tcPr>
+          <w:p>
+            <w:pPr>
+              <w:spacing w:after="40"/>
+            </w:pPr>
+            <w:r>
+              <w:rPr>
+                <w:b w:val="0"/>
+                <w:i w:val="0"/>
+                <w:color w:val="0B0B0B"/>
+                <w:sz w:val="17"/>
+              </w:rPr>
+              <w:t>F3B1</w:t>
+            </w:r>
+          </w:p>
+        </w:tc>
+        <w:tc>
+          <w:tcPr>
+            <w:tcW w:type="dxa" w:w="1360"/>
+          </w:tcPr>
+          <w:p>
+            <w:pPr>
+              <w:spacing w:after="40"/>
+            </w:pPr>
+            <w:r>
+              <w:rPr>
+                <w:b w:val="0"/>
+                <w:i w:val="0"/>
+                <w:color w:val="0B0B0B"/>
+                <w:sz w:val="17"/>
+              </w:rPr>
+              <w:t>22.36 °C</w:t>
+            </w:r>
+          </w:p>
+        </w:tc>
+        <w:tc>
+          <w:tcPr>
+            <w:tcW w:type="dxa" w:w="1360"/>
+          </w:tcPr>
+          <w:p>
+            <w:pPr>
+              <w:spacing w:after="40"/>
+            </w:pPr>
+            <w:r>
+              <w:rPr>
+                <w:b w:val="0"/>
+                <w:i w:val="0"/>
+                <w:color w:val="0B0B0B"/>
+                <w:sz w:val="17"/>
+              </w:rPr>
+              <w:t>23.13 °C</w:t>
+            </w:r>
+          </w:p>
+        </w:tc>
+        <w:tc>
+          <w:tcPr>
+            <w:tcW w:type="dxa" w:w="1360"/>
+          </w:tcPr>
+          <w:p>
+            <w:pPr>
+              <w:spacing w:after="40"/>
+            </w:pPr>
+            <w:r>
+              <w:rPr>
+                <w:b w:val="0"/>
+                <w:i w:val="0"/>
+                <w:color w:val="0B0B0B"/>
+                <w:sz w:val="17"/>
+              </w:rPr>
+              <w:t>33.65 °C</w:t>
+            </w:r>
+          </w:p>
+        </w:tc>
+        <w:tc>
+          <w:tcPr>
+            <w:tcW w:type="dxa" w:w="1360"/>
+          </w:tcPr>
+          <w:p>
+            <w:pPr>
+              <w:spacing w:after="40"/>
+            </w:pPr>
+            <w:r>
+              <w:rPr>
+                <w:b w:val="0"/>
+                <w:i w:val="0"/>
+                <w:color w:val="0B0B0B"/>
+                <w:sz w:val="17"/>
+              </w:rPr>
+              <w:t>10.52 K</w:t>
             </w:r>
           </w:p>
         </w:tc>
@@ -5966,7 +5966,7 @@
                 <w:color w:val="0B0B0B"/>
                 <w:sz w:val="17"/>
               </w:rPr>
-              <w:t>33.31 °C</w:t>
+              <w:t>33.32 °C</w:t>
             </w:r>
           </w:p>
         </w:tc>
@@ -6042,7 +6042,7 @@
                 <w:color w:val="0B0B0B"/>
                 <w:sz w:val="17"/>
               </w:rPr>
-              <w:t>55.5 Pa</w:t>
+              <w:t>55.6 Pa</w:t>
             </w:r>
           </w:p>
         </w:tc>
@@ -6158,7 +6158,7 @@
                 <w:color w:val="0B0B0B"/>
                 <w:sz w:val="17"/>
               </w:rPr>
-              <w:t>53.1 Pa</w:t>
+              <w:t>53.3 Pa</w:t>
             </w:r>
           </w:p>
         </w:tc>
@@ -6198,7 +6198,7 @@
                 <w:color w:val="0B0B0B"/>
                 <w:sz w:val="17"/>
               </w:rPr>
-              <w:t>33.36 °C</w:t>
+              <w:t>33.38 °C</w:t>
             </w:r>
           </w:p>
         </w:tc>
@@ -6314,7 +6314,7 @@
                 <w:color w:val="0B0B0B"/>
                 <w:sz w:val="17"/>
               </w:rPr>
-              <w:t>33.40 °C</w:t>
+              <w:t>33.41 °C</w:t>
             </w:r>
           </w:p>
         </w:tc>
@@ -6390,7 +6390,7 @@
                 <w:color w:val="0B0B0B"/>
                 <w:sz w:val="17"/>
               </w:rPr>
-              <w:t>53.0 Pa</w:t>
+              <w:t>52.8 Pa</w:t>
             </w:r>
           </w:p>
         </w:tc>
@@ -6412,586 +6412,6 @@
                 <w:sz w:val="17"/>
               </w:rPr>
               <w:t>5</w:t>
-            </w:r>
-          </w:p>
-        </w:tc>
-        <w:tc>
-          <w:tcPr>
-            <w:tcW w:type="dxa" w:w="1586"/>
-          </w:tcPr>
-          <w:p>
-            <w:pPr>
-              <w:spacing w:after="40"/>
-            </w:pPr>
-            <w:r>
-              <w:rPr>
-                <w:b w:val="0"/>
-                <w:i w:val="0"/>
-                <w:color w:val="0B0B0B"/>
-                <w:sz w:val="17"/>
-              </w:rPr>
-              <w:t>33.38 °C</w:t>
-            </w:r>
-          </w:p>
-        </w:tc>
-        <w:tc>
-          <w:tcPr>
-            <w:tcW w:type="dxa" w:w="1586"/>
-          </w:tcPr>
-          <w:p>
-            <w:pPr>
-              <w:spacing w:after="40"/>
-            </w:pPr>
-            <w:r>
-              <w:rPr>
-                <w:b w:val="0"/>
-                <w:i w:val="0"/>
-                <w:color w:val="0B0B0B"/>
-                <w:sz w:val="17"/>
-              </w:rPr>
-              <w:t>31.7 kg/s</w:t>
-            </w:r>
-          </w:p>
-        </w:tc>
-        <w:tc>
-          <w:tcPr>
-            <w:tcW w:type="dxa" w:w="1586"/>
-          </w:tcPr>
-          <w:p>
-            <w:pPr>
-              <w:spacing w:after="40"/>
-            </w:pPr>
-            <w:r>
-              <w:rPr>
-                <w:b w:val="0"/>
-                <w:i w:val="0"/>
-                <w:color w:val="0B0B0B"/>
-                <w:sz w:val="17"/>
-              </w:rPr>
-              <w:t>365 kW</w:t>
-            </w:r>
-          </w:p>
-        </w:tc>
-        <w:tc>
-          <w:tcPr>
-            <w:tcW w:type="dxa" w:w="1586"/>
-          </w:tcPr>
-          <w:p>
-            <w:pPr>
-              <w:spacing w:after="40"/>
-            </w:pPr>
-            <w:r>
-              <w:rPr>
-                <w:b w:val="0"/>
-                <w:i w:val="0"/>
-                <w:color w:val="0B0B0B"/>
-                <w:sz w:val="17"/>
-              </w:rPr>
-              <w:t>84 %</w:t>
-            </w:r>
-          </w:p>
-        </w:tc>
-        <w:tc>
-          <w:tcPr>
-            <w:tcW w:type="dxa" w:w="1586"/>
-          </w:tcPr>
-          <w:p>
-            <w:pPr>
-              <w:spacing w:after="40"/>
-            </w:pPr>
-            <w:r>
-              <w:rPr>
-                <w:b w:val="0"/>
-                <w:i w:val="0"/>
-                <w:color w:val="0B0B0B"/>
-                <w:sz w:val="17"/>
-              </w:rPr>
-              <w:t>56.2 Pa</w:t>
-            </w:r>
-          </w:p>
-        </w:tc>
-      </w:tr>
-      <w:tr>
-        <w:tc>
-          <w:tcPr>
-            <w:tcW w:type="dxa" w:w="1586"/>
-          </w:tcPr>
-          <w:p>
-            <w:pPr>
-              <w:spacing w:after="40"/>
-            </w:pPr>
-            <w:r>
-              <w:rPr>
-                <w:b w:val="0"/>
-                <w:i w:val="0"/>
-                <w:color w:val="0B0B0B"/>
-                <w:sz w:val="17"/>
-              </w:rPr>
-              <w:t>6</w:t>
-            </w:r>
-          </w:p>
-        </w:tc>
-        <w:tc>
-          <w:tcPr>
-            <w:tcW w:type="dxa" w:w="1586"/>
-          </w:tcPr>
-          <w:p>
-            <w:pPr>
-              <w:spacing w:after="40"/>
-            </w:pPr>
-            <w:r>
-              <w:rPr>
-                <w:b w:val="0"/>
-                <w:i w:val="0"/>
-                <w:color w:val="0B0B0B"/>
-                <w:sz w:val="17"/>
-              </w:rPr>
-              <w:t>33.35 °C</w:t>
-            </w:r>
-          </w:p>
-        </w:tc>
-        <w:tc>
-          <w:tcPr>
-            <w:tcW w:type="dxa" w:w="1586"/>
-          </w:tcPr>
-          <w:p>
-            <w:pPr>
-              <w:spacing w:after="40"/>
-            </w:pPr>
-            <w:r>
-              <w:rPr>
-                <w:b w:val="0"/>
-                <w:i w:val="0"/>
-                <w:color w:val="0B0B0B"/>
-                <w:sz w:val="17"/>
-              </w:rPr>
-              <w:t>31.7 kg/s</w:t>
-            </w:r>
-          </w:p>
-        </w:tc>
-        <w:tc>
-          <w:tcPr>
-            <w:tcW w:type="dxa" w:w="1586"/>
-          </w:tcPr>
-          <w:p>
-            <w:pPr>
-              <w:spacing w:after="40"/>
-            </w:pPr>
-            <w:r>
-              <w:rPr>
-                <w:b w:val="0"/>
-                <w:i w:val="0"/>
-                <w:color w:val="0B0B0B"/>
-                <w:sz w:val="17"/>
-              </w:rPr>
-              <w:t>364 kW</w:t>
-            </w:r>
-          </w:p>
-        </w:tc>
-        <w:tc>
-          <w:tcPr>
-            <w:tcW w:type="dxa" w:w="1586"/>
-          </w:tcPr>
-          <w:p>
-            <w:pPr>
-              <w:spacing w:after="40"/>
-            </w:pPr>
-            <w:r>
-              <w:rPr>
-                <w:b w:val="0"/>
-                <w:i w:val="0"/>
-                <w:color w:val="0B0B0B"/>
-                <w:sz w:val="17"/>
-              </w:rPr>
-              <w:t>84 %</w:t>
-            </w:r>
-          </w:p>
-        </w:tc>
-        <w:tc>
-          <w:tcPr>
-            <w:tcW w:type="dxa" w:w="1586"/>
-          </w:tcPr>
-          <w:p>
-            <w:pPr>
-              <w:spacing w:after="40"/>
-            </w:pPr>
-            <w:r>
-              <w:rPr>
-                <w:b w:val="0"/>
-                <w:i w:val="0"/>
-                <w:color w:val="0B0B0B"/>
-                <w:sz w:val="17"/>
-              </w:rPr>
-              <w:t>53.2 Pa</w:t>
-            </w:r>
-          </w:p>
-        </w:tc>
-      </w:tr>
-      <w:tr>
-        <w:tc>
-          <w:tcPr>
-            <w:tcW w:type="dxa" w:w="1586"/>
-          </w:tcPr>
-          <w:p>
-            <w:pPr>
-              <w:spacing w:after="40"/>
-            </w:pPr>
-            <w:r>
-              <w:rPr>
-                <w:b w:val="0"/>
-                <w:i w:val="0"/>
-                <w:color w:val="0B0B0B"/>
-                <w:sz w:val="17"/>
-              </w:rPr>
-              <w:t>7</w:t>
-            </w:r>
-          </w:p>
-        </w:tc>
-        <w:tc>
-          <w:tcPr>
-            <w:tcW w:type="dxa" w:w="1586"/>
-          </w:tcPr>
-          <w:p>
-            <w:pPr>
-              <w:spacing w:after="40"/>
-            </w:pPr>
-            <w:r>
-              <w:rPr>
-                <w:b w:val="0"/>
-                <w:i w:val="0"/>
-                <w:color w:val="0B0B0B"/>
-                <w:sz w:val="17"/>
-              </w:rPr>
-              <w:t>33.32 °C</w:t>
-            </w:r>
-          </w:p>
-        </w:tc>
-        <w:tc>
-          <w:tcPr>
-            <w:tcW w:type="dxa" w:w="1586"/>
-          </w:tcPr>
-          <w:p>
-            <w:pPr>
-              <w:spacing w:after="40"/>
-            </w:pPr>
-            <w:r>
-              <w:rPr>
-                <w:b w:val="0"/>
-                <w:i w:val="0"/>
-                <w:color w:val="0B0B0B"/>
-                <w:sz w:val="17"/>
-              </w:rPr>
-              <w:t>31.7 kg/s</w:t>
-            </w:r>
-          </w:p>
-        </w:tc>
-        <w:tc>
-          <w:tcPr>
-            <w:tcW w:type="dxa" w:w="1586"/>
-          </w:tcPr>
-          <w:p>
-            <w:pPr>
-              <w:spacing w:after="40"/>
-            </w:pPr>
-            <w:r>
-              <w:rPr>
-                <w:b w:val="0"/>
-                <w:i w:val="0"/>
-                <w:color w:val="0B0B0B"/>
-                <w:sz w:val="17"/>
-              </w:rPr>
-              <w:t>363 kW</w:t>
-            </w:r>
-          </w:p>
-        </w:tc>
-        <w:tc>
-          <w:tcPr>
-            <w:tcW w:type="dxa" w:w="1586"/>
-          </w:tcPr>
-          <w:p>
-            <w:pPr>
-              <w:spacing w:after="40"/>
-            </w:pPr>
-            <w:r>
-              <w:rPr>
-                <w:b w:val="0"/>
-                <w:i w:val="0"/>
-                <w:color w:val="0B0B0B"/>
-                <w:sz w:val="17"/>
-              </w:rPr>
-              <w:t>84 %</w:t>
-            </w:r>
-          </w:p>
-        </w:tc>
-        <w:tc>
-          <w:tcPr>
-            <w:tcW w:type="dxa" w:w="1586"/>
-          </w:tcPr>
-          <w:p>
-            <w:pPr>
-              <w:spacing w:after="40"/>
-            </w:pPr>
-            <w:r>
-              <w:rPr>
-                <w:b w:val="0"/>
-                <w:i w:val="0"/>
-                <w:color w:val="0B0B0B"/>
-                <w:sz w:val="17"/>
-              </w:rPr>
-              <w:t>55.5 Pa</w:t>
-            </w:r>
-          </w:p>
-        </w:tc>
-      </w:tr>
-      <w:tr>
-        <w:tc>
-          <w:tcPr>
-            <w:tcW w:type="dxa" w:w="1586"/>
-          </w:tcPr>
-          <w:p>
-            <w:pPr>
-              <w:spacing w:after="40"/>
-            </w:pPr>
-            <w:r>
-              <w:rPr>
-                <w:b w:val="0"/>
-                <w:i w:val="0"/>
-                <w:color w:val="0B0B0B"/>
-                <w:sz w:val="17"/>
-              </w:rPr>
-              <w:t>8</w:t>
-            </w:r>
-          </w:p>
-        </w:tc>
-        <w:tc>
-          <w:tcPr>
-            <w:tcW w:type="dxa" w:w="1586"/>
-          </w:tcPr>
-          <w:p>
-            <w:pPr>
-              <w:spacing w:after="40"/>
-            </w:pPr>
-            <w:r>
-              <w:rPr>
-                <w:b w:val="0"/>
-                <w:i w:val="0"/>
-                <w:color w:val="0B0B0B"/>
-                <w:sz w:val="17"/>
-              </w:rPr>
-              <w:t>33.32 °C</w:t>
-            </w:r>
-          </w:p>
-        </w:tc>
-        <w:tc>
-          <w:tcPr>
-            <w:tcW w:type="dxa" w:w="1586"/>
-          </w:tcPr>
-          <w:p>
-            <w:pPr>
-              <w:spacing w:after="40"/>
-            </w:pPr>
-            <w:r>
-              <w:rPr>
-                <w:b w:val="0"/>
-                <w:i w:val="0"/>
-                <w:color w:val="0B0B0B"/>
-                <w:sz w:val="17"/>
-              </w:rPr>
-              <w:t>31.7 kg/s</w:t>
-            </w:r>
-          </w:p>
-        </w:tc>
-        <w:tc>
-          <w:tcPr>
-            <w:tcW w:type="dxa" w:w="1586"/>
-          </w:tcPr>
-          <w:p>
-            <w:pPr>
-              <w:spacing w:after="40"/>
-            </w:pPr>
-            <w:r>
-              <w:rPr>
-                <w:b w:val="0"/>
-                <w:i w:val="0"/>
-                <w:color w:val="0B0B0B"/>
-                <w:sz w:val="17"/>
-              </w:rPr>
-              <w:t>363 kW</w:t>
-            </w:r>
-          </w:p>
-        </w:tc>
-        <w:tc>
-          <w:tcPr>
-            <w:tcW w:type="dxa" w:w="1586"/>
-          </w:tcPr>
-          <w:p>
-            <w:pPr>
-              <w:spacing w:after="40"/>
-            </w:pPr>
-            <w:r>
-              <w:rPr>
-                <w:b w:val="0"/>
-                <w:i w:val="0"/>
-                <w:color w:val="0B0B0B"/>
-                <w:sz w:val="17"/>
-              </w:rPr>
-              <w:t>84 %</w:t>
-            </w:r>
-          </w:p>
-        </w:tc>
-        <w:tc>
-          <w:tcPr>
-            <w:tcW w:type="dxa" w:w="1586"/>
-          </w:tcPr>
-          <w:p>
-            <w:pPr>
-              <w:spacing w:after="40"/>
-            </w:pPr>
-            <w:r>
-              <w:rPr>
-                <w:b w:val="0"/>
-                <w:i w:val="0"/>
-                <w:color w:val="0B0B0B"/>
-                <w:sz w:val="17"/>
-              </w:rPr>
-              <w:t>54.6 Pa</w:t>
-            </w:r>
-          </w:p>
-        </w:tc>
-      </w:tr>
-      <w:tr>
-        <w:tc>
-          <w:tcPr>
-            <w:tcW w:type="dxa" w:w="1586"/>
-          </w:tcPr>
-          <w:p>
-            <w:pPr>
-              <w:spacing w:after="40"/>
-            </w:pPr>
-            <w:r>
-              <w:rPr>
-                <w:b w:val="0"/>
-                <w:i w:val="0"/>
-                <w:color w:val="0B0B0B"/>
-                <w:sz w:val="17"/>
-              </w:rPr>
-              <w:t>9</w:t>
-            </w:r>
-          </w:p>
-        </w:tc>
-        <w:tc>
-          <w:tcPr>
-            <w:tcW w:type="dxa" w:w="1586"/>
-          </w:tcPr>
-          <w:p>
-            <w:pPr>
-              <w:spacing w:after="40"/>
-            </w:pPr>
-            <w:r>
-              <w:rPr>
-                <w:b w:val="0"/>
-                <w:i w:val="0"/>
-                <w:color w:val="0B0B0B"/>
-                <w:sz w:val="17"/>
-              </w:rPr>
-              <w:t>33.33 °C</w:t>
-            </w:r>
-          </w:p>
-        </w:tc>
-        <w:tc>
-          <w:tcPr>
-            <w:tcW w:type="dxa" w:w="1586"/>
-          </w:tcPr>
-          <w:p>
-            <w:pPr>
-              <w:spacing w:after="40"/>
-            </w:pPr>
-            <w:r>
-              <w:rPr>
-                <w:b w:val="0"/>
-                <w:i w:val="0"/>
-                <w:color w:val="0B0B0B"/>
-                <w:sz w:val="17"/>
-              </w:rPr>
-              <w:t>31.7 kg/s</w:t>
-            </w:r>
-          </w:p>
-        </w:tc>
-        <w:tc>
-          <w:tcPr>
-            <w:tcW w:type="dxa" w:w="1586"/>
-          </w:tcPr>
-          <w:p>
-            <w:pPr>
-              <w:spacing w:after="40"/>
-            </w:pPr>
-            <w:r>
-              <w:rPr>
-                <w:b w:val="0"/>
-                <w:i w:val="0"/>
-                <w:color w:val="0B0B0B"/>
-                <w:sz w:val="17"/>
-              </w:rPr>
-              <w:t>363 kW</w:t>
-            </w:r>
-          </w:p>
-        </w:tc>
-        <w:tc>
-          <w:tcPr>
-            <w:tcW w:type="dxa" w:w="1586"/>
-          </w:tcPr>
-          <w:p>
-            <w:pPr>
-              <w:spacing w:after="40"/>
-            </w:pPr>
-            <w:r>
-              <w:rPr>
-                <w:b w:val="0"/>
-                <w:i w:val="0"/>
-                <w:color w:val="0B0B0B"/>
-                <w:sz w:val="17"/>
-              </w:rPr>
-              <w:t>84 %</w:t>
-            </w:r>
-          </w:p>
-        </w:tc>
-        <w:tc>
-          <w:tcPr>
-            <w:tcW w:type="dxa" w:w="1586"/>
-          </w:tcPr>
-          <w:p>
-            <w:pPr>
-              <w:spacing w:after="40"/>
-            </w:pPr>
-            <w:r>
-              <w:rPr>
-                <w:b w:val="0"/>
-                <w:i w:val="0"/>
-                <w:color w:val="0B0B0B"/>
-                <w:sz w:val="17"/>
-              </w:rPr>
-              <w:t>53.4 Pa</w:t>
-            </w:r>
-          </w:p>
-        </w:tc>
-      </w:tr>
-      <w:tr>
-        <w:tc>
-          <w:tcPr>
-            <w:tcW w:type="dxa" w:w="1586"/>
-          </w:tcPr>
-          <w:p>
-            <w:pPr>
-              <w:spacing w:after="40"/>
-            </w:pPr>
-            <w:r>
-              <w:rPr>
-                <w:b w:val="0"/>
-                <w:i w:val="0"/>
-                <w:color w:val="0B0B0B"/>
-                <w:sz w:val="17"/>
-              </w:rPr>
-              <w:t>10</w:t>
             </w:r>
           </w:p>
         </w:tc>
@@ -7086,7 +6506,587 @@
                 <w:color w:val="0B0B0B"/>
                 <w:sz w:val="17"/>
               </w:rPr>
+              <w:t>56.3 Pa</w:t>
+            </w:r>
+          </w:p>
+        </w:tc>
+      </w:tr>
+      <w:tr>
+        <w:tc>
+          <w:tcPr>
+            <w:tcW w:type="dxa" w:w="1586"/>
+          </w:tcPr>
+          <w:p>
+            <w:pPr>
+              <w:spacing w:after="40"/>
+            </w:pPr>
+            <w:r>
+              <w:rPr>
+                <w:b w:val="0"/>
+                <w:i w:val="0"/>
+                <w:color w:val="0B0B0B"/>
+                <w:sz w:val="17"/>
+              </w:rPr>
+              <w:t>6</w:t>
+            </w:r>
+          </w:p>
+        </w:tc>
+        <w:tc>
+          <w:tcPr>
+            <w:tcW w:type="dxa" w:w="1586"/>
+          </w:tcPr>
+          <w:p>
+            <w:pPr>
+              <w:spacing w:after="40"/>
+            </w:pPr>
+            <w:r>
+              <w:rPr>
+                <w:b w:val="0"/>
+                <w:i w:val="0"/>
+                <w:color w:val="0B0B0B"/>
+                <w:sz w:val="17"/>
+              </w:rPr>
+              <w:t>33.34 °C</w:t>
+            </w:r>
+          </w:p>
+        </w:tc>
+        <w:tc>
+          <w:tcPr>
+            <w:tcW w:type="dxa" w:w="1586"/>
+          </w:tcPr>
+          <w:p>
+            <w:pPr>
+              <w:spacing w:after="40"/>
+            </w:pPr>
+            <w:r>
+              <w:rPr>
+                <w:b w:val="0"/>
+                <w:i w:val="0"/>
+                <w:color w:val="0B0B0B"/>
+                <w:sz w:val="17"/>
+              </w:rPr>
+              <w:t>31.7 kg/s</w:t>
+            </w:r>
+          </w:p>
+        </w:tc>
+        <w:tc>
+          <w:tcPr>
+            <w:tcW w:type="dxa" w:w="1586"/>
+          </w:tcPr>
+          <w:p>
+            <w:pPr>
+              <w:spacing w:after="40"/>
+            </w:pPr>
+            <w:r>
+              <w:rPr>
+                <w:b w:val="0"/>
+                <w:i w:val="0"/>
+                <w:color w:val="0B0B0B"/>
+                <w:sz w:val="17"/>
+              </w:rPr>
+              <w:t>364 kW</w:t>
+            </w:r>
+          </w:p>
+        </w:tc>
+        <w:tc>
+          <w:tcPr>
+            <w:tcW w:type="dxa" w:w="1586"/>
+          </w:tcPr>
+          <w:p>
+            <w:pPr>
+              <w:spacing w:after="40"/>
+            </w:pPr>
+            <w:r>
+              <w:rPr>
+                <w:b w:val="0"/>
+                <w:i w:val="0"/>
+                <w:color w:val="0B0B0B"/>
+                <w:sz w:val="17"/>
+              </w:rPr>
+              <w:t>84 %</w:t>
+            </w:r>
+          </w:p>
+        </w:tc>
+        <w:tc>
+          <w:tcPr>
+            <w:tcW w:type="dxa" w:w="1586"/>
+          </w:tcPr>
+          <w:p>
+            <w:pPr>
+              <w:spacing w:after="40"/>
+            </w:pPr>
+            <w:r>
+              <w:rPr>
+                <w:b w:val="0"/>
+                <w:i w:val="0"/>
+                <w:color w:val="0B0B0B"/>
+                <w:sz w:val="17"/>
+              </w:rPr>
               <w:t>53.3 Pa</w:t>
+            </w:r>
+          </w:p>
+        </w:tc>
+      </w:tr>
+      <w:tr>
+        <w:tc>
+          <w:tcPr>
+            <w:tcW w:type="dxa" w:w="1586"/>
+          </w:tcPr>
+          <w:p>
+            <w:pPr>
+              <w:spacing w:after="40"/>
+            </w:pPr>
+            <w:r>
+              <w:rPr>
+                <w:b w:val="0"/>
+                <w:i w:val="0"/>
+                <w:color w:val="0B0B0B"/>
+                <w:sz w:val="17"/>
+              </w:rPr>
+              <w:t>7</w:t>
+            </w:r>
+          </w:p>
+        </w:tc>
+        <w:tc>
+          <w:tcPr>
+            <w:tcW w:type="dxa" w:w="1586"/>
+          </w:tcPr>
+          <w:p>
+            <w:pPr>
+              <w:spacing w:after="40"/>
+            </w:pPr>
+            <w:r>
+              <w:rPr>
+                <w:b w:val="0"/>
+                <w:i w:val="0"/>
+                <w:color w:val="0B0B0B"/>
+                <w:sz w:val="17"/>
+              </w:rPr>
+              <w:t>33.31 °C</w:t>
+            </w:r>
+          </w:p>
+        </w:tc>
+        <w:tc>
+          <w:tcPr>
+            <w:tcW w:type="dxa" w:w="1586"/>
+          </w:tcPr>
+          <w:p>
+            <w:pPr>
+              <w:spacing w:after="40"/>
+            </w:pPr>
+            <w:r>
+              <w:rPr>
+                <w:b w:val="0"/>
+                <w:i w:val="0"/>
+                <w:color w:val="0B0B0B"/>
+                <w:sz w:val="17"/>
+              </w:rPr>
+              <w:t>31.7 kg/s</w:t>
+            </w:r>
+          </w:p>
+        </w:tc>
+        <w:tc>
+          <w:tcPr>
+            <w:tcW w:type="dxa" w:w="1586"/>
+          </w:tcPr>
+          <w:p>
+            <w:pPr>
+              <w:spacing w:after="40"/>
+            </w:pPr>
+            <w:r>
+              <w:rPr>
+                <w:b w:val="0"/>
+                <w:i w:val="0"/>
+                <w:color w:val="0B0B0B"/>
+                <w:sz w:val="17"/>
+              </w:rPr>
+              <w:t>363 kW</w:t>
+            </w:r>
+          </w:p>
+        </w:tc>
+        <w:tc>
+          <w:tcPr>
+            <w:tcW w:type="dxa" w:w="1586"/>
+          </w:tcPr>
+          <w:p>
+            <w:pPr>
+              <w:spacing w:after="40"/>
+            </w:pPr>
+            <w:r>
+              <w:rPr>
+                <w:b w:val="0"/>
+                <w:i w:val="0"/>
+                <w:color w:val="0B0B0B"/>
+                <w:sz w:val="17"/>
+              </w:rPr>
+              <w:t>84 %</w:t>
+            </w:r>
+          </w:p>
+        </w:tc>
+        <w:tc>
+          <w:tcPr>
+            <w:tcW w:type="dxa" w:w="1586"/>
+          </w:tcPr>
+          <w:p>
+            <w:pPr>
+              <w:spacing w:after="40"/>
+            </w:pPr>
+            <w:r>
+              <w:rPr>
+                <w:b w:val="0"/>
+                <w:i w:val="0"/>
+                <w:color w:val="0B0B0B"/>
+                <w:sz w:val="17"/>
+              </w:rPr>
+              <w:t>55.8 Pa</w:t>
+            </w:r>
+          </w:p>
+        </w:tc>
+      </w:tr>
+      <w:tr>
+        <w:tc>
+          <w:tcPr>
+            <w:tcW w:type="dxa" w:w="1586"/>
+          </w:tcPr>
+          <w:p>
+            <w:pPr>
+              <w:spacing w:after="40"/>
+            </w:pPr>
+            <w:r>
+              <w:rPr>
+                <w:b w:val="0"/>
+                <w:i w:val="0"/>
+                <w:color w:val="0B0B0B"/>
+                <w:sz w:val="17"/>
+              </w:rPr>
+              <w:t>8</w:t>
+            </w:r>
+          </w:p>
+        </w:tc>
+        <w:tc>
+          <w:tcPr>
+            <w:tcW w:type="dxa" w:w="1586"/>
+          </w:tcPr>
+          <w:p>
+            <w:pPr>
+              <w:spacing w:after="40"/>
+            </w:pPr>
+            <w:r>
+              <w:rPr>
+                <w:b w:val="0"/>
+                <w:i w:val="0"/>
+                <w:color w:val="0B0B0B"/>
+                <w:sz w:val="17"/>
+              </w:rPr>
+              <w:t>33.34 °C</w:t>
+            </w:r>
+          </w:p>
+        </w:tc>
+        <w:tc>
+          <w:tcPr>
+            <w:tcW w:type="dxa" w:w="1586"/>
+          </w:tcPr>
+          <w:p>
+            <w:pPr>
+              <w:spacing w:after="40"/>
+            </w:pPr>
+            <w:r>
+              <w:rPr>
+                <w:b w:val="0"/>
+                <w:i w:val="0"/>
+                <w:color w:val="0B0B0B"/>
+                <w:sz w:val="17"/>
+              </w:rPr>
+              <w:t>31.7 kg/s</w:t>
+            </w:r>
+          </w:p>
+        </w:tc>
+        <w:tc>
+          <w:tcPr>
+            <w:tcW w:type="dxa" w:w="1586"/>
+          </w:tcPr>
+          <w:p>
+            <w:pPr>
+              <w:spacing w:after="40"/>
+            </w:pPr>
+            <w:r>
+              <w:rPr>
+                <w:b w:val="0"/>
+                <w:i w:val="0"/>
+                <w:color w:val="0B0B0B"/>
+                <w:sz w:val="17"/>
+              </w:rPr>
+              <w:t>364 kW</w:t>
+            </w:r>
+          </w:p>
+        </w:tc>
+        <w:tc>
+          <w:tcPr>
+            <w:tcW w:type="dxa" w:w="1586"/>
+          </w:tcPr>
+          <w:p>
+            <w:pPr>
+              <w:spacing w:after="40"/>
+            </w:pPr>
+            <w:r>
+              <w:rPr>
+                <w:b w:val="0"/>
+                <w:i w:val="0"/>
+                <w:color w:val="0B0B0B"/>
+                <w:sz w:val="17"/>
+              </w:rPr>
+              <w:t>84 %</w:t>
+            </w:r>
+          </w:p>
+        </w:tc>
+        <w:tc>
+          <w:tcPr>
+            <w:tcW w:type="dxa" w:w="1586"/>
+          </w:tcPr>
+          <w:p>
+            <w:pPr>
+              <w:spacing w:after="40"/>
+            </w:pPr>
+            <w:r>
+              <w:rPr>
+                <w:b w:val="0"/>
+                <w:i w:val="0"/>
+                <w:color w:val="0B0B0B"/>
+                <w:sz w:val="17"/>
+              </w:rPr>
+              <w:t>54.2 Pa</w:t>
+            </w:r>
+          </w:p>
+        </w:tc>
+      </w:tr>
+      <w:tr>
+        <w:tc>
+          <w:tcPr>
+            <w:tcW w:type="dxa" w:w="1586"/>
+          </w:tcPr>
+          <w:p>
+            <w:pPr>
+              <w:spacing w:after="40"/>
+            </w:pPr>
+            <w:r>
+              <w:rPr>
+                <w:b w:val="0"/>
+                <w:i w:val="0"/>
+                <w:color w:val="0B0B0B"/>
+                <w:sz w:val="17"/>
+              </w:rPr>
+              <w:t>9</w:t>
+            </w:r>
+          </w:p>
+        </w:tc>
+        <w:tc>
+          <w:tcPr>
+            <w:tcW w:type="dxa" w:w="1586"/>
+          </w:tcPr>
+          <w:p>
+            <w:pPr>
+              <w:spacing w:after="40"/>
+            </w:pPr>
+            <w:r>
+              <w:rPr>
+                <w:b w:val="0"/>
+                <w:i w:val="0"/>
+                <w:color w:val="0B0B0B"/>
+                <w:sz w:val="17"/>
+              </w:rPr>
+              <w:t>33.34 °C</w:t>
+            </w:r>
+          </w:p>
+        </w:tc>
+        <w:tc>
+          <w:tcPr>
+            <w:tcW w:type="dxa" w:w="1586"/>
+          </w:tcPr>
+          <w:p>
+            <w:pPr>
+              <w:spacing w:after="40"/>
+            </w:pPr>
+            <w:r>
+              <w:rPr>
+                <w:b w:val="0"/>
+                <w:i w:val="0"/>
+                <w:color w:val="0B0B0B"/>
+                <w:sz w:val="17"/>
+              </w:rPr>
+              <w:t>31.7 kg/s</w:t>
+            </w:r>
+          </w:p>
+        </w:tc>
+        <w:tc>
+          <w:tcPr>
+            <w:tcW w:type="dxa" w:w="1586"/>
+          </w:tcPr>
+          <w:p>
+            <w:pPr>
+              <w:spacing w:after="40"/>
+            </w:pPr>
+            <w:r>
+              <w:rPr>
+                <w:b w:val="0"/>
+                <w:i w:val="0"/>
+                <w:color w:val="0B0B0B"/>
+                <w:sz w:val="17"/>
+              </w:rPr>
+              <w:t>364 kW</w:t>
+            </w:r>
+          </w:p>
+        </w:tc>
+        <w:tc>
+          <w:tcPr>
+            <w:tcW w:type="dxa" w:w="1586"/>
+          </w:tcPr>
+          <w:p>
+            <w:pPr>
+              <w:spacing w:after="40"/>
+            </w:pPr>
+            <w:r>
+              <w:rPr>
+                <w:b w:val="0"/>
+                <w:i w:val="0"/>
+                <w:color w:val="0B0B0B"/>
+                <w:sz w:val="17"/>
+              </w:rPr>
+              <w:t>84 %</w:t>
+            </w:r>
+          </w:p>
+        </w:tc>
+        <w:tc>
+          <w:tcPr>
+            <w:tcW w:type="dxa" w:w="1586"/>
+          </w:tcPr>
+          <w:p>
+            <w:pPr>
+              <w:spacing w:after="40"/>
+            </w:pPr>
+            <w:r>
+              <w:rPr>
+                <w:b w:val="0"/>
+                <w:i w:val="0"/>
+                <w:color w:val="0B0B0B"/>
+                <w:sz w:val="17"/>
+              </w:rPr>
+              <w:t>53.1 Pa</w:t>
+            </w:r>
+          </w:p>
+        </w:tc>
+      </w:tr>
+      <w:tr>
+        <w:tc>
+          <w:tcPr>
+            <w:tcW w:type="dxa" w:w="1586"/>
+          </w:tcPr>
+          <w:p>
+            <w:pPr>
+              <w:spacing w:after="40"/>
+            </w:pPr>
+            <w:r>
+              <w:rPr>
+                <w:b w:val="0"/>
+                <w:i w:val="0"/>
+                <w:color w:val="0B0B0B"/>
+                <w:sz w:val="17"/>
+              </w:rPr>
+              <w:t>10</w:t>
+            </w:r>
+          </w:p>
+        </w:tc>
+        <w:tc>
+          <w:tcPr>
+            <w:tcW w:type="dxa" w:w="1586"/>
+          </w:tcPr>
+          <w:p>
+            <w:pPr>
+              <w:spacing w:after="40"/>
+            </w:pPr>
+            <w:r>
+              <w:rPr>
+                <w:b w:val="0"/>
+                <w:i w:val="0"/>
+                <w:color w:val="0B0B0B"/>
+                <w:sz w:val="17"/>
+              </w:rPr>
+              <w:t>33.36 °C</w:t>
+            </w:r>
+          </w:p>
+        </w:tc>
+        <w:tc>
+          <w:tcPr>
+            <w:tcW w:type="dxa" w:w="1586"/>
+          </w:tcPr>
+          <w:p>
+            <w:pPr>
+              <w:spacing w:after="40"/>
+            </w:pPr>
+            <w:r>
+              <w:rPr>
+                <w:b w:val="0"/>
+                <w:i w:val="0"/>
+                <w:color w:val="0B0B0B"/>
+                <w:sz w:val="17"/>
+              </w:rPr>
+              <w:t>31.7 kg/s</w:t>
+            </w:r>
+          </w:p>
+        </w:tc>
+        <w:tc>
+          <w:tcPr>
+            <w:tcW w:type="dxa" w:w="1586"/>
+          </w:tcPr>
+          <w:p>
+            <w:pPr>
+              <w:spacing w:after="40"/>
+            </w:pPr>
+            <w:r>
+              <w:rPr>
+                <w:b w:val="0"/>
+                <w:i w:val="0"/>
+                <w:color w:val="0B0B0B"/>
+                <w:sz w:val="17"/>
+              </w:rPr>
+              <w:t>364 kW</w:t>
+            </w:r>
+          </w:p>
+        </w:tc>
+        <w:tc>
+          <w:tcPr>
+            <w:tcW w:type="dxa" w:w="1586"/>
+          </w:tcPr>
+          <w:p>
+            <w:pPr>
+              <w:spacing w:after="40"/>
+            </w:pPr>
+            <w:r>
+              <w:rPr>
+                <w:b w:val="0"/>
+                <w:i w:val="0"/>
+                <w:color w:val="0B0B0B"/>
+                <w:sz w:val="17"/>
+              </w:rPr>
+              <w:t>84 %</w:t>
+            </w:r>
+          </w:p>
+        </w:tc>
+        <w:tc>
+          <w:tcPr>
+            <w:tcW w:type="dxa" w:w="1586"/>
+          </w:tcPr>
+          <w:p>
+            <w:pPr>
+              <w:spacing w:after="40"/>
+            </w:pPr>
+            <w:r>
+              <w:rPr>
+                <w:b w:val="0"/>
+                <w:i w:val="0"/>
+                <w:color w:val="0B0B0B"/>
+                <w:sz w:val="17"/>
+              </w:rPr>
+              <w:t>53.7 Pa</w:t>
             </w:r>
           </w:p>
         </w:tc>
@@ -7202,7 +7202,7 @@
                 <w:color w:val="0B0B0B"/>
                 <w:sz w:val="17"/>
               </w:rPr>
-              <w:t>54.9 Pa</w:t>
+              <w:t>54.7 Pa</w:t>
             </w:r>
           </w:p>
         </w:tc>
@@ -7242,7 +7242,7 @@
                 <w:color w:val="0B0B0B"/>
                 <w:sz w:val="17"/>
               </w:rPr>
-              <w:t>33.38 °C</w:t>
+              <w:t>33.37 °C</w:t>
             </w:r>
           </w:p>
         </w:tc>
@@ -7318,7 +7318,7 @@
                 <w:color w:val="0B0B0B"/>
                 <w:sz w:val="17"/>
               </w:rPr>
-              <w:t>54.8 Pa</w:t>
+              <w:t>54.9 Pa</w:t>
             </w:r>
           </w:p>
         </w:tc>
@@ -7358,7 +7358,7 @@
                 <w:color w:val="0B0B0B"/>
                 <w:sz w:val="17"/>
               </w:rPr>
-              <w:t>33.35 °C</w:t>
+              <w:t>33.33 °C</w:t>
             </w:r>
           </w:p>
         </w:tc>
@@ -7434,7 +7434,7 @@
                 <w:color w:val="0B0B0B"/>
                 <w:sz w:val="17"/>
               </w:rPr>
-              <w:t>52.8 Pa</w:t>
+              <w:t>53.0 Pa</w:t>
             </w:r>
           </w:p>
         </w:tc>
@@ -7607,7 +7607,7 @@
           <w:color w:val="0B0B0B"/>
           <w:sz w:val="20"/>
         </w:rPr>
-        <w:t>The air delivered to the IT equipment is within the ASHRAE class A1 recommended range. The warmest rack intake is 22.49 °C at rack F5B1-17, measured at the top of the rack, leaving 4.51 K of margin against the 27 °C recommended limit.</w:t>
+        <w:t>The air delivered to the IT equipment is within the ASHRAE class A1 recommended range. The warmest rack intake is 22.45 °C at rack F6B2-03, measured at the top of the rack, leaving 4.55 K of margin against the 27 °C recommended limit.</w:t>
       </w:r>
     </w:p>
     <w:p>
@@ -7622,7 +7622,7 @@
           <w:color w:val="0B0B0B"/>
           <w:sz w:val="20"/>
         </w:rPr>
-        <w:t>The cooling plant is thermally uniform in this configuration: the return air temperature spans 0.10 K across the 14 units, from 33.30 °C to 33.40 °C.</w:t>
+        <w:t>The cooling plant is thermally uniform in this configuration: the return air temperature spans 0.11 K across the 14 units, from 33.30 °C to 33.41 °C.</w:t>
       </w:r>
     </w:p>
     <w:p>
@@ -7637,7 +7637,7 @@
           <w:color w:val="0B0B0B"/>
           <w:sz w:val="20"/>
         </w:rPr>
-        <w:t>The plant removes 5,100 kW. No unit exceeds its catalogue rating of 432.6 kW; the most loaded is at 85 % of it.</w:t>
+        <w:t>The plant removes 5,099 kW. No unit exceeds its catalogue rating of 432.6 kW; the most loaded is at 85 % of it.</w:t>
       </w:r>
     </w:p>
     <w:p>
@@ -7652,7 +7652,7 @@
           <w:color w:val="0B0B0B"/>
           <w:sz w:val="20"/>
         </w:rPr>
-        <w:t>The room costs the most loaded unit 56.2 Pa of the 131 Pa the unit can produce at the airflow it is moving (43 %), and the least loaded 52.8 Pa. That is the resistance of the room, not of the coil and filters inside the machine, which the unit's external static pressure already accounts for.</w:t>
+        <w:t>The room costs the most loaded unit 56.3 Pa of the 131 Pa the unit can produce at the airflow it is moving (43 %), and the least loaded 52.8 Pa. That is the resistance of the room, not of the coil and filters inside the machine, which the unit's external static pressure already accounts for.</w:t>
       </w:r>
     </w:p>
     <w:p>

</xml_diff>